<commit_message>
Batch 19 — v2.1 classifier-corrected panel rerun (v1.0.0-rc3): manuscript/supplement/Supplement_v0.3.0.docx
</commit_message>
<xml_diff>
--- a/manuscript/supplement/Supplement_v0.3.0.docx
+++ b/manuscript/supplement/Supplement_v0.3.0.docx
@@ -132,7 +132,7 @@
         <w:keepNext/>
         <w:spacing w:before="240" w:after="120"/>
       </w:pPr>
-      <w:bookmarkStart w:id="77458" w:name="provenance"/>
+      <w:bookmarkStart w:id="26444" w:name="provenance"/>
       <w:r>
         <w:rPr>
           <w:rFonts w:ascii="Arial" w:hAnsi="Arial"/>
@@ -142,7 +142,7 @@
         </w:rPr>
         <w:t>Data provenance declaration</w:t>
       </w:r>
-      <w:bookmarkEnd w:id="77458"/>
+      <w:bookmarkEnd w:id="26444"/>
     </w:p>
     <w:p>
       <w:r>
@@ -225,7 +225,7 @@
         <w:keepNext/>
         <w:spacing w:before="240" w:after="120"/>
       </w:pPr>
-      <w:bookmarkStart w:id="51420" w:name="toc"/>
+      <w:bookmarkStart w:id="30271" w:name="toc"/>
       <w:r>
         <w:rPr>
           <w:rFonts w:ascii="Arial" w:hAnsi="Arial"/>
@@ -235,7 +235,7 @@
         </w:rPr>
         <w:t>Contents</w:t>
       </w:r>
-      <w:bookmarkEnd w:id="51420"/>
+      <w:bookmarkEnd w:id="30271"/>
     </w:p>
     <w:p>
       <w:pPr>
@@ -587,7 +587,7 @@
         <w:keepNext/>
         <w:spacing w:before="240" w:after="120"/>
       </w:pPr>
-      <w:bookmarkStart w:id="70310" w:name="note_s1"/>
+      <w:bookmarkStart w:id="3655" w:name="note_s1"/>
       <w:r>
         <w:rPr>
           <w:rFonts w:ascii="Arial" w:hAnsi="Arial"/>
@@ -597,7 +597,7 @@
         </w:rPr>
         <w:t>Note S1 — Bulbul (2019) transferability probe</w:t>
       </w:r>
-      <w:bookmarkEnd w:id="70310"/>
+      <w:bookmarkEnd w:id="3655"/>
     </w:p>
     <w:bookmarkStart w:id="31" w:name="X4c77ddbcd03ac00f69e68661e5eb39a4c24f13a"/>
     <w:p>
@@ -4437,7 +4437,7 @@
         <w:keepNext/>
         <w:spacing w:before="240" w:after="120"/>
       </w:pPr>
-      <w:bookmarkStart w:id="36816" w:name="note_s2"/>
+      <w:bookmarkStart w:id="69809" w:name="note_s2"/>
       <w:r>
         <w:rPr>
           <w:rFonts w:ascii="Arial" w:hAnsi="Arial"/>
@@ -4447,7 +4447,7 @@
         </w:rPr>
         <w:t>Note S2 — Pre-Kharif Bay-of-Bengal cyclone climatology</w:t>
       </w:r>
-      <w:bookmarkEnd w:id="36816"/>
+      <w:bookmarkEnd w:id="69809"/>
     </w:p>
     <w:bookmarkStart w:id="31" w:name="Xba8bf53b4b47f874330c06c76f2a0ce4ee29e13"/>
     <w:p>
@@ -7557,7 +7557,7 @@
         <w:keepNext/>
         <w:spacing w:before="240" w:after="120"/>
       </w:pPr>
-      <w:bookmarkStart w:id="317" w:name="note_s3"/>
+      <w:bookmarkStart w:id="73433" w:name="note_s3"/>
       <w:r>
         <w:rPr>
           <w:rFonts w:ascii="Arial" w:hAnsi="Arial"/>
@@ -7567,7 +7567,7 @@
         </w:rPr>
         <w:t>Note S3 — Sentinel-1 dual-polarisation backscatter signatures</w:t>
       </w:r>
-      <w:bookmarkEnd w:id="317"/>
+      <w:bookmarkEnd w:id="73433"/>
     </w:p>
     <w:bookmarkStart w:id="31" w:name="X3d655c27041e8d6d2856959bf2a6f9e8861d5e2"/>
     <w:p>
@@ -11016,7 +11016,7 @@
         <w:keepNext/>
         <w:spacing w:before="240" w:after="120"/>
       </w:pPr>
-      <w:bookmarkStart w:id="59246" w:name="table_s1"/>
+      <w:bookmarkStart w:id="58150" w:name="table_s1"/>
       <w:r>
         <w:rPr>
           <w:rFonts w:ascii="Arial" w:hAnsi="Arial"/>
@@ -11026,7 +11026,7 @@
         </w:rPr>
         <w:t>Table S1 — Static TWFE-DiD point estimates</w:t>
       </w:r>
-      <w:bookmarkEnd w:id="59246"/>
+      <w:bookmarkEnd w:id="58150"/>
     </w:p>
     <w:p>
       <w:pPr>
@@ -11762,7 +11762,7 @@
                 <w:rFonts w:ascii="Arial" w:hAnsi="Arial"/>
                 <w:sz w:val="20"/>
               </w:rPr>
-              <w:t>+15.218</w:t>
+              <w:t>+15.108</w:t>
             </w:r>
           </w:p>
         </w:tc>
@@ -11776,7 +11776,7 @@
                 <w:rFonts w:ascii="Arial" w:hAnsi="Arial"/>
                 <w:sz w:val="20"/>
               </w:rPr>
-              <w:t>17.337</w:t>
+              <w:t>17.312</w:t>
             </w:r>
           </w:p>
         </w:tc>
@@ -11790,7 +11790,7 @@
                 <w:rFonts w:ascii="Arial" w:hAnsi="Arial"/>
                 <w:sz w:val="20"/>
               </w:rPr>
-              <w:t>0.878</w:t>
+              <w:t>0.873</w:t>
             </w:r>
           </w:p>
         </w:tc>
@@ -11804,7 +11804,7 @@
                 <w:rFonts w:ascii="Arial" w:hAnsi="Arial"/>
                 <w:sz w:val="20"/>
               </w:rPr>
-              <w:t>0.380</w:t>
+              <w:t>0.383</w:t>
             </w:r>
           </w:p>
         </w:tc>
@@ -11818,7 +11818,7 @@
                 <w:rFonts w:ascii="Arial" w:hAnsi="Arial"/>
                 <w:sz w:val="20"/>
               </w:rPr>
-              <w:t>-18.762</w:t>
+              <w:t>-18.822</w:t>
             </w:r>
           </w:p>
         </w:tc>
@@ -11832,7 +11832,7 @@
                 <w:rFonts w:ascii="Arial" w:hAnsi="Arial"/>
                 <w:sz w:val="20"/>
               </w:rPr>
-              <w:t>49.197</w:t>
+              <w:t>49.039</w:t>
             </w:r>
           </w:p>
         </w:tc>
@@ -11918,7 +11918,7 @@
                 <w:rFonts w:ascii="Arial" w:hAnsi="Arial"/>
                 <w:sz w:val="20"/>
               </w:rPr>
-              <w:t>-3.623</w:t>
+              <w:t>-3.677</w:t>
             </w:r>
           </w:p>
         </w:tc>
@@ -11932,7 +11932,7 @@
                 <w:rFonts w:ascii="Arial" w:hAnsi="Arial"/>
                 <w:sz w:val="20"/>
               </w:rPr>
-              <w:t>2.891</w:t>
+              <w:t>2.897</w:t>
             </w:r>
           </w:p>
         </w:tc>
@@ -11946,7 +11946,7 @@
                 <w:rFonts w:ascii="Arial" w:hAnsi="Arial"/>
                 <w:sz w:val="20"/>
               </w:rPr>
-              <w:t>-1.253</w:t>
+              <w:t>-1.269</w:t>
             </w:r>
           </w:p>
         </w:tc>
@@ -11960,7 +11960,7 @@
                 <w:rFonts w:ascii="Arial" w:hAnsi="Arial"/>
                 <w:sz w:val="20"/>
               </w:rPr>
-              <w:t>0.210</w:t>
+              <w:t>0.204</w:t>
             </w:r>
           </w:p>
         </w:tc>
@@ -11974,7 +11974,7 @@
                 <w:rFonts w:ascii="Arial" w:hAnsi="Arial"/>
                 <w:sz w:val="20"/>
               </w:rPr>
-              <w:t>-9.289</w:t>
+              <w:t>-9.356</w:t>
             </w:r>
           </w:p>
         </w:tc>
@@ -11988,7 +11988,7 @@
                 <w:rFonts w:ascii="Arial" w:hAnsi="Arial"/>
                 <w:sz w:val="20"/>
               </w:rPr>
-              <w:t>2.042</w:t>
+              <w:t>2.002</w:t>
             </w:r>
           </w:p>
         </w:tc>
@@ -12074,7 +12074,7 @@
                 <w:rFonts w:ascii="Arial" w:hAnsi="Arial"/>
                 <w:sz w:val="20"/>
               </w:rPr>
-              <w:t>-0.098</w:t>
+              <w:t>-0.239</w:t>
             </w:r>
           </w:p>
         </w:tc>
@@ -12088,7 +12088,7 @@
                 <w:rFonts w:ascii="Arial" w:hAnsi="Arial"/>
                 <w:sz w:val="20"/>
               </w:rPr>
-              <w:t>0.062</w:t>
+              <w:t>0.169</w:t>
             </w:r>
           </w:p>
         </w:tc>
@@ -12102,7 +12102,7 @@
                 <w:rFonts w:ascii="Arial" w:hAnsi="Arial"/>
                 <w:sz w:val="20"/>
               </w:rPr>
-              <w:t>-1.589</w:t>
+              <w:t>-1.411</w:t>
             </w:r>
           </w:p>
         </w:tc>
@@ -12116,7 +12116,7 @@
                 <w:rFonts w:ascii="Arial" w:hAnsi="Arial"/>
                 <w:sz w:val="20"/>
               </w:rPr>
-              <w:t>0.112</w:t>
+              <w:t>0.158</w:t>
             </w:r>
           </w:p>
         </w:tc>
@@ -12130,7 +12130,7 @@
                 <w:rFonts w:ascii="Arial" w:hAnsi="Arial"/>
                 <w:sz w:val="20"/>
               </w:rPr>
-              <w:t>-0.219</w:t>
+              <w:t>-0.570</w:t>
             </w:r>
           </w:p>
         </w:tc>
@@ -12144,7 +12144,7 @@
                 <w:rFonts w:ascii="Arial" w:hAnsi="Arial"/>
                 <w:sz w:val="20"/>
               </w:rPr>
-              <w:t>0.023</w:t>
+              <w:t>0.093</w:t>
             </w:r>
           </w:p>
         </w:tc>
@@ -12158,7 +12158,7 @@
                 <w:rFonts w:ascii="Arial" w:hAnsi="Arial"/>
                 <w:sz w:val="20"/>
               </w:rPr>
-              <w:t>0.059</w:t>
+              <w:t>0.074</w:t>
             </w:r>
           </w:p>
         </w:tc>
@@ -12188,7 +12188,7 @@
         <w:keepNext/>
         <w:spacing w:before="240" w:after="120"/>
       </w:pPr>
-      <w:bookmarkStart w:id="12926" w:name="table_s2"/>
+      <w:bookmarkStart w:id="62942" w:name="table_s2"/>
       <w:r>
         <w:rPr>
           <w:rFonts w:ascii="Arial" w:hAnsi="Arial"/>
@@ -12198,7 +12198,7 @@
         </w:rPr>
         <w:t>Table S2 — Pre-trend tests</w:t>
       </w:r>
-      <w:bookmarkEnd w:id="12926"/>
+      <w:bookmarkEnd w:id="62942"/>
     </w:p>
     <w:p>
       <w:pPr>
@@ -12950,7 +12950,7 @@
         <w:keepNext/>
         <w:spacing w:before="240" w:after="120"/>
       </w:pPr>
-      <w:bookmarkStart w:id="39372" w:name="table_s3"/>
+      <w:bookmarkStart w:id="6830" w:name="table_s3"/>
       <w:r>
         <w:rPr>
           <w:rFonts w:ascii="Arial" w:hAnsi="Arial"/>
@@ -12960,7 +12960,7 @@
         </w:rPr>
         <w:t>Table S3 — Bulbul transferability residuals</w:t>
       </w:r>
-      <w:bookmarkEnd w:id="39372"/>
+      <w:bookmarkEnd w:id="6830"/>
     </w:p>
     <w:p>
       <w:pPr>
@@ -13666,7 +13666,7 @@
         <w:keepNext/>
         <w:spacing w:before="240" w:after="120"/>
       </w:pPr>
-      <w:bookmarkStart w:id="76455" w:name="table_s4"/>
+      <w:bookmarkStart w:id="44256" w:name="table_s4"/>
       <w:r>
         <w:rPr>
           <w:rFonts w:ascii="Arial" w:hAnsi="Arial"/>
@@ -13676,7 +13676,7 @@
         </w:rPr>
         <w:t>Table S4 — Wild-cluster bootstrap (G = 8)</w:t>
       </w:r>
-      <w:bookmarkEnd w:id="76455"/>
+      <w:bookmarkEnd w:id="44256"/>
     </w:p>
     <w:p>
       <w:pPr>
@@ -14210,7 +14210,7 @@
                 <w:rFonts w:ascii="Arial" w:hAnsi="Arial"/>
                 <w:sz w:val="20"/>
               </w:rPr>
-              <w:t>+15.218</w:t>
+              <w:t>+15.108</w:t>
             </w:r>
           </w:p>
         </w:tc>
@@ -14224,7 +14224,7 @@
                 <w:rFonts w:ascii="Arial" w:hAnsi="Arial"/>
                 <w:sz w:val="20"/>
               </w:rPr>
-              <w:t>0.878</w:t>
+              <w:t>0.873</w:t>
             </w:r>
           </w:p>
         </w:tc>
@@ -14324,7 +14324,7 @@
                 <w:rFonts w:ascii="Arial" w:hAnsi="Arial"/>
                 <w:sz w:val="20"/>
               </w:rPr>
-              <w:t>-3.623</w:t>
+              <w:t>-3.677</w:t>
             </w:r>
           </w:p>
         </w:tc>
@@ -14338,7 +14338,7 @@
                 <w:rFonts w:ascii="Arial" w:hAnsi="Arial"/>
                 <w:sz w:val="20"/>
               </w:rPr>
-              <w:t>-1.253</w:t>
+              <w:t>-1.269</w:t>
             </w:r>
           </w:p>
         </w:tc>
@@ -14438,7 +14438,7 @@
                 <w:rFonts w:ascii="Arial" w:hAnsi="Arial"/>
                 <w:sz w:val="20"/>
               </w:rPr>
-              <w:t>-0.098</w:t>
+              <w:t>-0.239</w:t>
             </w:r>
           </w:p>
         </w:tc>
@@ -14452,7 +14452,7 @@
                 <w:rFonts w:ascii="Arial" w:hAnsi="Arial"/>
                 <w:sz w:val="20"/>
               </w:rPr>
-              <w:t>-1.589</w:t>
+              <w:t>-1.411</w:t>
             </w:r>
           </w:p>
         </w:tc>
@@ -14480,7 +14480,7 @@
                 <w:rFonts w:ascii="Arial" w:hAnsi="Arial"/>
                 <w:sz w:val="20"/>
               </w:rPr>
-              <w:t>0.1570</w:t>
+              <w:t>0.2035</w:t>
             </w:r>
           </w:p>
         </w:tc>
@@ -14538,7 +14538,7 @@
         <w:keepNext/>
         <w:spacing w:before="240" w:after="120"/>
       </w:pPr>
-      <w:bookmarkStart w:id="25915" w:name="table_s5"/>
+      <w:bookmarkStart w:id="63462" w:name="table_s5"/>
       <w:r>
         <w:rPr>
           <w:rFonts w:ascii="Arial" w:hAnsi="Arial"/>
@@ -14548,7 +14548,7 @@
         </w:rPr>
         <w:t>Table S5 — Jackknife leave-one-out</w:t>
       </w:r>
-      <w:bookmarkEnd w:id="25915"/>
+      <w:bookmarkEnd w:id="63462"/>
     </w:p>
     <w:p>
       <w:pPr>
@@ -14966,7 +14966,7 @@
                 <w:rFonts w:ascii="Arial" w:hAnsi="Arial"/>
                 <w:sz w:val="20"/>
               </w:rPr>
-              <w:t>+15.218</w:t>
+              <w:t>+15.108</w:t>
             </w:r>
           </w:p>
         </w:tc>
@@ -14980,7 +14980,7 @@
                 <w:rFonts w:ascii="Arial" w:hAnsi="Arial"/>
                 <w:sz w:val="20"/>
               </w:rPr>
-              <w:t>76.4</w:t>
+              <w:t>76.7</w:t>
             </w:r>
           </w:p>
         </w:tc>
@@ -15052,7 +15052,7 @@
                 <w:rFonts w:ascii="Arial" w:hAnsi="Arial"/>
                 <w:sz w:val="20"/>
               </w:rPr>
-              <w:t>-3.623</w:t>
+              <w:t>-3.677</w:t>
             </w:r>
           </w:p>
         </w:tc>
@@ -15066,7 +15066,7 @@
                 <w:rFonts w:ascii="Arial" w:hAnsi="Arial"/>
                 <w:sz w:val="20"/>
               </w:rPr>
-              <w:t>55.5</w:t>
+              <w:t>54.7</w:t>
             </w:r>
           </w:p>
         </w:tc>
@@ -15138,7 +15138,7 @@
                 <w:rFonts w:ascii="Arial" w:hAnsi="Arial"/>
                 <w:sz w:val="20"/>
               </w:rPr>
-              <w:t>-0.098</w:t>
+              <w:t>-0.239</w:t>
             </w:r>
           </w:p>
         </w:tc>
@@ -15152,7 +15152,7 @@
                 <w:rFonts w:ascii="Arial" w:hAnsi="Arial"/>
                 <w:sz w:val="20"/>
               </w:rPr>
-              <w:t>40.7</w:t>
+              <w:t>60.2</w:t>
             </w:r>
           </w:p>
         </w:tc>
@@ -15166,7 +15166,7 @@
                 <w:rFonts w:ascii="Arial" w:hAnsi="Arial"/>
                 <w:sz w:val="20"/>
               </w:rPr>
-              <w:t>Baleshwar</w:t>
+              <w:t>Bhadrak</w:t>
             </w:r>
           </w:p>
         </w:tc>
@@ -18845,77 +18845,77 @@
                 <w:rFonts w:ascii="Arial" w:hAnsi="Arial"/>
                 <w:sz w:val="18"/>
               </w:rPr>
-              <w:t>+21.672</w:t>
-            </w:r>
-          </w:p>
-        </w:tc>
-        <w:tc>
-          <w:tcPr>
-            <w:tcW w:type="dxa" w:w="864"/>
-          </w:tcPr>
-          <w:p>
-            <w:r>
-              <w:rPr>
-                <w:rFonts w:ascii="Arial" w:hAnsi="Arial"/>
-                <w:sz w:val="18"/>
-              </w:rPr>
-              <w:t>16.557</w:t>
-            </w:r>
-          </w:p>
-        </w:tc>
-        <w:tc>
-          <w:tcPr>
-            <w:tcW w:type="dxa" w:w="864"/>
-          </w:tcPr>
-          <w:p>
-            <w:r>
-              <w:rPr>
-                <w:rFonts w:ascii="Arial" w:hAnsi="Arial"/>
-                <w:sz w:val="18"/>
-              </w:rPr>
-              <w:t>0.191</w:t>
-            </w:r>
-          </w:p>
-        </w:tc>
-        <w:tc>
-          <w:tcPr>
-            <w:tcW w:type="dxa" w:w="864"/>
-          </w:tcPr>
-          <w:p>
-            <w:r>
-              <w:rPr>
-                <w:rFonts w:ascii="Arial" w:hAnsi="Arial"/>
-                <w:sz w:val="18"/>
-              </w:rPr>
-              <w:t>-10.779</w:t>
-            </w:r>
-          </w:p>
-        </w:tc>
-        <w:tc>
-          <w:tcPr>
-            <w:tcW w:type="dxa" w:w="864"/>
-          </w:tcPr>
-          <w:p>
-            <w:r>
-              <w:rPr>
-                <w:rFonts w:ascii="Arial" w:hAnsi="Arial"/>
-                <w:sz w:val="18"/>
-              </w:rPr>
-              <w:t>54.123</w:t>
-            </w:r>
-          </w:p>
-        </w:tc>
-        <w:tc>
-          <w:tcPr>
-            <w:tcW w:type="dxa" w:w="864"/>
-          </w:tcPr>
-          <w:p>
-            <w:r>
-              <w:rPr>
-                <w:rFonts w:ascii="Arial" w:hAnsi="Arial"/>
-                <w:sz w:val="18"/>
-              </w:rPr>
-              <w:t>42.400</w:t>
+              <w:t>+21.563</w:t>
+            </w:r>
+          </w:p>
+        </w:tc>
+        <w:tc>
+          <w:tcPr>
+            <w:tcW w:type="dxa" w:w="864"/>
+          </w:tcPr>
+          <w:p>
+            <w:r>
+              <w:rPr>
+                <w:rFonts w:ascii="Arial" w:hAnsi="Arial"/>
+                <w:sz w:val="18"/>
+              </w:rPr>
+              <w:t>16.529</w:t>
+            </w:r>
+          </w:p>
+        </w:tc>
+        <w:tc>
+          <w:tcPr>
+            <w:tcW w:type="dxa" w:w="864"/>
+          </w:tcPr>
+          <w:p>
+            <w:r>
+              <w:rPr>
+                <w:rFonts w:ascii="Arial" w:hAnsi="Arial"/>
+                <w:sz w:val="18"/>
+              </w:rPr>
+              <w:t>0.192</w:t>
+            </w:r>
+          </w:p>
+        </w:tc>
+        <w:tc>
+          <w:tcPr>
+            <w:tcW w:type="dxa" w:w="864"/>
+          </w:tcPr>
+          <w:p>
+            <w:r>
+              <w:rPr>
+                <w:rFonts w:ascii="Arial" w:hAnsi="Arial"/>
+                <w:sz w:val="18"/>
+              </w:rPr>
+              <w:t>-10.834</w:t>
+            </w:r>
+          </w:p>
+        </w:tc>
+        <w:tc>
+          <w:tcPr>
+            <w:tcW w:type="dxa" w:w="864"/>
+          </w:tcPr>
+          <w:p>
+            <w:r>
+              <w:rPr>
+                <w:rFonts w:ascii="Arial" w:hAnsi="Arial"/>
+                <w:sz w:val="18"/>
+              </w:rPr>
+              <w:t>53.959</w:t>
+            </w:r>
+          </w:p>
+        </w:tc>
+        <w:tc>
+          <w:tcPr>
+            <w:tcW w:type="dxa" w:w="864"/>
+          </w:tcPr>
+          <w:p>
+            <w:r>
+              <w:rPr>
+                <w:rFonts w:ascii="Arial" w:hAnsi="Arial"/>
+                <w:sz w:val="18"/>
+              </w:rPr>
+              <w:t>42.700</w:t>
             </w:r>
           </w:p>
         </w:tc>
@@ -18987,77 +18987,77 @@
                 <w:rFonts w:ascii="Arial" w:hAnsi="Arial"/>
                 <w:sz w:val="18"/>
               </w:rPr>
-              <w:t>+10.166</w:t>
-            </w:r>
-          </w:p>
-        </w:tc>
-        <w:tc>
-          <w:tcPr>
-            <w:tcW w:type="dxa" w:w="864"/>
-          </w:tcPr>
-          <w:p>
-            <w:r>
-              <w:rPr>
-                <w:rFonts w:ascii="Arial" w:hAnsi="Arial"/>
-                <w:sz w:val="18"/>
-              </w:rPr>
-              <w:t>20.343</w:t>
-            </w:r>
-          </w:p>
-        </w:tc>
-        <w:tc>
-          <w:tcPr>
-            <w:tcW w:type="dxa" w:w="864"/>
-          </w:tcPr>
-          <w:p>
-            <w:r>
-              <w:rPr>
-                <w:rFonts w:ascii="Arial" w:hAnsi="Arial"/>
-                <w:sz w:val="18"/>
-              </w:rPr>
-              <w:t>0.617</w:t>
-            </w:r>
-          </w:p>
-        </w:tc>
-        <w:tc>
-          <w:tcPr>
-            <w:tcW w:type="dxa" w:w="864"/>
-          </w:tcPr>
-          <w:p>
-            <w:r>
-              <w:rPr>
-                <w:rFonts w:ascii="Arial" w:hAnsi="Arial"/>
-                <w:sz w:val="18"/>
-              </w:rPr>
-              <w:t>-29.706</w:t>
-            </w:r>
-          </w:p>
-        </w:tc>
-        <w:tc>
-          <w:tcPr>
-            <w:tcW w:type="dxa" w:w="864"/>
-          </w:tcPr>
-          <w:p>
-            <w:r>
-              <w:rPr>
-                <w:rFonts w:ascii="Arial" w:hAnsi="Arial"/>
-                <w:sz w:val="18"/>
-              </w:rPr>
-              <w:t>50.037</w:t>
-            </w:r>
-          </w:p>
-        </w:tc>
-        <w:tc>
-          <w:tcPr>
-            <w:tcW w:type="dxa" w:w="864"/>
-          </w:tcPr>
-          <w:p>
-            <w:r>
-              <w:rPr>
-                <w:rFonts w:ascii="Arial" w:hAnsi="Arial"/>
-                <w:sz w:val="18"/>
-              </w:rPr>
-              <w:t>-33.200</w:t>
+              <w:t>+10.035</w:t>
+            </w:r>
+          </w:p>
+        </w:tc>
+        <w:tc>
+          <w:tcPr>
+            <w:tcW w:type="dxa" w:w="864"/>
+          </w:tcPr>
+          <w:p>
+            <w:r>
+              <w:rPr>
+                <w:rFonts w:ascii="Arial" w:hAnsi="Arial"/>
+                <w:sz w:val="18"/>
+              </w:rPr>
+              <w:t>20.297</w:t>
+            </w:r>
+          </w:p>
+        </w:tc>
+        <w:tc>
+          <w:tcPr>
+            <w:tcW w:type="dxa" w:w="864"/>
+          </w:tcPr>
+          <w:p>
+            <w:r>
+              <w:rPr>
+                <w:rFonts w:ascii="Arial" w:hAnsi="Arial"/>
+                <w:sz w:val="18"/>
+              </w:rPr>
+              <w:t>0.621</w:t>
+            </w:r>
+          </w:p>
+        </w:tc>
+        <w:tc>
+          <w:tcPr>
+            <w:tcW w:type="dxa" w:w="864"/>
+          </w:tcPr>
+          <w:p>
+            <w:r>
+              <w:rPr>
+                <w:rFonts w:ascii="Arial" w:hAnsi="Arial"/>
+                <w:sz w:val="18"/>
+              </w:rPr>
+              <w:t>-29.747</w:t>
+            </w:r>
+          </w:p>
+        </w:tc>
+        <w:tc>
+          <w:tcPr>
+            <w:tcW w:type="dxa" w:w="864"/>
+          </w:tcPr>
+          <w:p>
+            <w:r>
+              <w:rPr>
+                <w:rFonts w:ascii="Arial" w:hAnsi="Arial"/>
+                <w:sz w:val="18"/>
+              </w:rPr>
+              <w:t>49.816</w:t>
+            </w:r>
+          </w:p>
+        </w:tc>
+        <w:tc>
+          <w:tcPr>
+            <w:tcW w:type="dxa" w:w="864"/>
+          </w:tcPr>
+          <w:p>
+            <w:r>
+              <w:rPr>
+                <w:rFonts w:ascii="Arial" w:hAnsi="Arial"/>
+                <w:sz w:val="18"/>
+              </w:rPr>
+              <w:t>-33.600</w:t>
             </w:r>
           </w:p>
         </w:tc>
@@ -19129,77 +19129,77 @@
                 <w:rFonts w:ascii="Arial" w:hAnsi="Arial"/>
                 <w:sz w:val="18"/>
               </w:rPr>
-              <w:t>+3.592</w:t>
-            </w:r>
-          </w:p>
-        </w:tc>
-        <w:tc>
-          <w:tcPr>
-            <w:tcW w:type="dxa" w:w="864"/>
-          </w:tcPr>
-          <w:p>
-            <w:r>
-              <w:rPr>
-                <w:rFonts w:ascii="Arial" w:hAnsi="Arial"/>
-                <w:sz w:val="18"/>
-              </w:rPr>
-              <w:t>14.120</w:t>
-            </w:r>
-          </w:p>
-        </w:tc>
-        <w:tc>
-          <w:tcPr>
-            <w:tcW w:type="dxa" w:w="864"/>
-          </w:tcPr>
-          <w:p>
-            <w:r>
-              <w:rPr>
-                <w:rFonts w:ascii="Arial" w:hAnsi="Arial"/>
-                <w:sz w:val="18"/>
-              </w:rPr>
-              <w:t>0.799</w:t>
-            </w:r>
-          </w:p>
-        </w:tc>
-        <w:tc>
-          <w:tcPr>
-            <w:tcW w:type="dxa" w:w="864"/>
-          </w:tcPr>
-          <w:p>
-            <w:r>
-              <w:rPr>
-                <w:rFonts w:ascii="Arial" w:hAnsi="Arial"/>
-                <w:sz w:val="18"/>
-              </w:rPr>
-              <w:t>-24.082</w:t>
-            </w:r>
-          </w:p>
-        </w:tc>
-        <w:tc>
-          <w:tcPr>
-            <w:tcW w:type="dxa" w:w="864"/>
-          </w:tcPr>
-          <w:p>
-            <w:r>
-              <w:rPr>
-                <w:rFonts w:ascii="Arial" w:hAnsi="Arial"/>
-                <w:sz w:val="18"/>
-              </w:rPr>
-              <w:t>31.267</w:t>
-            </w:r>
-          </w:p>
-        </w:tc>
-        <w:tc>
-          <w:tcPr>
-            <w:tcW w:type="dxa" w:w="864"/>
-          </w:tcPr>
-          <w:p>
-            <w:r>
-              <w:rPr>
-                <w:rFonts w:ascii="Arial" w:hAnsi="Arial"/>
-                <w:sz w:val="18"/>
-              </w:rPr>
-              <w:t>-76.400</w:t>
+              <w:t>+3.518</w:t>
+            </w:r>
+          </w:p>
+        </w:tc>
+        <w:tc>
+          <w:tcPr>
+            <w:tcW w:type="dxa" w:w="864"/>
+          </w:tcPr>
+          <w:p>
+            <w:r>
+              <w:rPr>
+                <w:rFonts w:ascii="Arial" w:hAnsi="Arial"/>
+                <w:sz w:val="18"/>
+              </w:rPr>
+              <w:t>14.126</w:t>
+            </w:r>
+          </w:p>
+        </w:tc>
+        <w:tc>
+          <w:tcPr>
+            <w:tcW w:type="dxa" w:w="864"/>
+          </w:tcPr>
+          <w:p>
+            <w:r>
+              <w:rPr>
+                <w:rFonts w:ascii="Arial" w:hAnsi="Arial"/>
+                <w:sz w:val="18"/>
+              </w:rPr>
+              <w:t>0.803</w:t>
+            </w:r>
+          </w:p>
+        </w:tc>
+        <w:tc>
+          <w:tcPr>
+            <w:tcW w:type="dxa" w:w="864"/>
+          </w:tcPr>
+          <w:p>
+            <w:r>
+              <w:rPr>
+                <w:rFonts w:ascii="Arial" w:hAnsi="Arial"/>
+                <w:sz w:val="18"/>
+              </w:rPr>
+              <w:t>-24.168</w:t>
+            </w:r>
+          </w:p>
+        </w:tc>
+        <w:tc>
+          <w:tcPr>
+            <w:tcW w:type="dxa" w:w="864"/>
+          </w:tcPr>
+          <w:p>
+            <w:r>
+              <w:rPr>
+                <w:rFonts w:ascii="Arial" w:hAnsi="Arial"/>
+                <w:sz w:val="18"/>
+              </w:rPr>
+              <w:t>31.204</w:t>
+            </w:r>
+          </w:p>
+        </w:tc>
+        <w:tc>
+          <w:tcPr>
+            <w:tcW w:type="dxa" w:w="864"/>
+          </w:tcPr>
+          <w:p>
+            <w:r>
+              <w:rPr>
+                <w:rFonts w:ascii="Arial" w:hAnsi="Arial"/>
+                <w:sz w:val="18"/>
+              </w:rPr>
+              <w:t>-76.700</w:t>
             </w:r>
           </w:p>
         </w:tc>
@@ -19271,77 +19271,77 @@
                 <w:rFonts w:ascii="Arial" w:hAnsi="Arial"/>
                 <w:sz w:val="18"/>
               </w:rPr>
-              <w:t>+10.475</w:t>
-            </w:r>
-          </w:p>
-        </w:tc>
-        <w:tc>
-          <w:tcPr>
-            <w:tcW w:type="dxa" w:w="864"/>
-          </w:tcPr>
-          <w:p>
-            <w:r>
-              <w:rPr>
-                <w:rFonts w:ascii="Arial" w:hAnsi="Arial"/>
-                <w:sz w:val="18"/>
-              </w:rPr>
-              <w:t>17.864</w:t>
-            </w:r>
-          </w:p>
-        </w:tc>
-        <w:tc>
-          <w:tcPr>
-            <w:tcW w:type="dxa" w:w="864"/>
-          </w:tcPr>
-          <w:p>
-            <w:r>
-              <w:rPr>
-                <w:rFonts w:ascii="Arial" w:hAnsi="Arial"/>
-                <w:sz w:val="18"/>
-              </w:rPr>
-              <w:t>0.558</w:t>
-            </w:r>
-          </w:p>
-        </w:tc>
-        <w:tc>
-          <w:tcPr>
-            <w:tcW w:type="dxa" w:w="864"/>
-          </w:tcPr>
-          <w:p>
-            <w:r>
-              <w:rPr>
-                <w:rFonts w:ascii="Arial" w:hAnsi="Arial"/>
-                <w:sz w:val="18"/>
-              </w:rPr>
-              <w:t>-24.538</w:t>
-            </w:r>
-          </w:p>
-        </w:tc>
-        <w:tc>
-          <w:tcPr>
-            <w:tcW w:type="dxa" w:w="864"/>
-          </w:tcPr>
-          <w:p>
-            <w:r>
-              <w:rPr>
-                <w:rFonts w:ascii="Arial" w:hAnsi="Arial"/>
-                <w:sz w:val="18"/>
-              </w:rPr>
-              <w:t>45.489</w:t>
-            </w:r>
-          </w:p>
-        </w:tc>
-        <w:tc>
-          <w:tcPr>
-            <w:tcW w:type="dxa" w:w="864"/>
-          </w:tcPr>
-          <w:p>
-            <w:r>
-              <w:rPr>
-                <w:rFonts w:ascii="Arial" w:hAnsi="Arial"/>
-                <w:sz w:val="18"/>
-              </w:rPr>
-              <w:t>-31.200</w:t>
+              <w:t>+10.366</w:t>
+            </w:r>
+          </w:p>
+        </w:tc>
+        <w:tc>
+          <w:tcPr>
+            <w:tcW w:type="dxa" w:w="864"/>
+          </w:tcPr>
+          <w:p>
+            <w:r>
+              <w:rPr>
+                <w:rFonts w:ascii="Arial" w:hAnsi="Arial"/>
+                <w:sz w:val="18"/>
+              </w:rPr>
+              <w:t>17.839</w:t>
+            </w:r>
+          </w:p>
+        </w:tc>
+        <w:tc>
+          <w:tcPr>
+            <w:tcW w:type="dxa" w:w="864"/>
+          </w:tcPr>
+          <w:p>
+            <w:r>
+              <w:rPr>
+                <w:rFonts w:ascii="Arial" w:hAnsi="Arial"/>
+                <w:sz w:val="18"/>
+              </w:rPr>
+              <w:t>0.561</w:t>
+            </w:r>
+          </w:p>
+        </w:tc>
+        <w:tc>
+          <w:tcPr>
+            <w:tcW w:type="dxa" w:w="864"/>
+          </w:tcPr>
+          <w:p>
+            <w:r>
+              <w:rPr>
+                <w:rFonts w:ascii="Arial" w:hAnsi="Arial"/>
+                <w:sz w:val="18"/>
+              </w:rPr>
+              <w:t>-24.597</w:t>
+            </w:r>
+          </w:p>
+        </w:tc>
+        <w:tc>
+          <w:tcPr>
+            <w:tcW w:type="dxa" w:w="864"/>
+          </w:tcPr>
+          <w:p>
+            <w:r>
+              <w:rPr>
+                <w:rFonts w:ascii="Arial" w:hAnsi="Arial"/>
+                <w:sz w:val="18"/>
+              </w:rPr>
+              <w:t>45.329</w:t>
+            </w:r>
+          </w:p>
+        </w:tc>
+        <w:tc>
+          <w:tcPr>
+            <w:tcW w:type="dxa" w:w="864"/>
+          </w:tcPr>
+          <w:p>
+            <w:r>
+              <w:rPr>
+                <w:rFonts w:ascii="Arial" w:hAnsi="Arial"/>
+                <w:sz w:val="18"/>
+              </w:rPr>
+              <w:t>-31.400</w:t>
             </w:r>
           </w:p>
         </w:tc>
@@ -19413,63 +19413,63 @@
                 <w:rFonts w:ascii="Arial" w:hAnsi="Arial"/>
                 <w:sz w:val="18"/>
               </w:rPr>
-              <w:t>+13.505</w:t>
-            </w:r>
-          </w:p>
-        </w:tc>
-        <w:tc>
-          <w:tcPr>
-            <w:tcW w:type="dxa" w:w="864"/>
-          </w:tcPr>
-          <w:p>
-            <w:r>
-              <w:rPr>
-                <w:rFonts w:ascii="Arial" w:hAnsi="Arial"/>
-                <w:sz w:val="18"/>
-              </w:rPr>
-              <w:t>19.106</w:t>
-            </w:r>
-          </w:p>
-        </w:tc>
-        <w:tc>
-          <w:tcPr>
-            <w:tcW w:type="dxa" w:w="864"/>
-          </w:tcPr>
-          <w:p>
-            <w:r>
-              <w:rPr>
-                <w:rFonts w:ascii="Arial" w:hAnsi="Arial"/>
-                <w:sz w:val="18"/>
-              </w:rPr>
-              <w:t>0.480</w:t>
-            </w:r>
-          </w:p>
-        </w:tc>
-        <w:tc>
-          <w:tcPr>
-            <w:tcW w:type="dxa" w:w="864"/>
-          </w:tcPr>
-          <w:p>
-            <w:r>
-              <w:rPr>
-                <w:rFonts w:ascii="Arial" w:hAnsi="Arial"/>
-                <w:sz w:val="18"/>
-              </w:rPr>
-              <w:t>-23.942</w:t>
-            </w:r>
-          </w:p>
-        </w:tc>
-        <w:tc>
-          <w:tcPr>
-            <w:tcW w:type="dxa" w:w="864"/>
-          </w:tcPr>
-          <w:p>
-            <w:r>
-              <w:rPr>
-                <w:rFonts w:ascii="Arial" w:hAnsi="Arial"/>
-                <w:sz w:val="18"/>
-              </w:rPr>
-              <w:t>50.953</w:t>
+              <w:t>+13.396</w:t>
+            </w:r>
+          </w:p>
+        </w:tc>
+        <w:tc>
+          <w:tcPr>
+            <w:tcW w:type="dxa" w:w="864"/>
+          </w:tcPr>
+          <w:p>
+            <w:r>
+              <w:rPr>
+                <w:rFonts w:ascii="Arial" w:hAnsi="Arial"/>
+                <w:sz w:val="18"/>
+              </w:rPr>
+              <w:t>19.082</w:t>
+            </w:r>
+          </w:p>
+        </w:tc>
+        <w:tc>
+          <w:tcPr>
+            <w:tcW w:type="dxa" w:w="864"/>
+          </w:tcPr>
+          <w:p>
+            <w:r>
+              <w:rPr>
+                <w:rFonts w:ascii="Arial" w:hAnsi="Arial"/>
+                <w:sz w:val="18"/>
+              </w:rPr>
+              <w:t>0.483</w:t>
+            </w:r>
+          </w:p>
+        </w:tc>
+        <w:tc>
+          <w:tcPr>
+            <w:tcW w:type="dxa" w:w="864"/>
+          </w:tcPr>
+          <w:p>
+            <w:r>
+              <w:rPr>
+                <w:rFonts w:ascii="Arial" w:hAnsi="Arial"/>
+                <w:sz w:val="18"/>
+              </w:rPr>
+              <w:t>-24.004</w:t>
+            </w:r>
+          </w:p>
+        </w:tc>
+        <w:tc>
+          <w:tcPr>
+            <w:tcW w:type="dxa" w:w="864"/>
+          </w:tcPr>
+          <w:p>
+            <w:r>
+              <w:rPr>
+                <w:rFonts w:ascii="Arial" w:hAnsi="Arial"/>
+                <w:sz w:val="18"/>
+              </w:rPr>
+              <w:t>50.796</w:t>
             </w:r>
           </w:p>
         </w:tc>
@@ -19555,77 +19555,77 @@
                 <w:rFonts w:ascii="Arial" w:hAnsi="Arial"/>
                 <w:sz w:val="18"/>
               </w:rPr>
-              <w:t>+17.836</w:t>
-            </w:r>
-          </w:p>
-        </w:tc>
-        <w:tc>
-          <w:tcPr>
-            <w:tcW w:type="dxa" w:w="864"/>
-          </w:tcPr>
-          <w:p>
-            <w:r>
-              <w:rPr>
-                <w:rFonts w:ascii="Arial" w:hAnsi="Arial"/>
-                <w:sz w:val="18"/>
-              </w:rPr>
-              <w:t>21.222</w:t>
-            </w:r>
-          </w:p>
-        </w:tc>
-        <w:tc>
-          <w:tcPr>
-            <w:tcW w:type="dxa" w:w="864"/>
-          </w:tcPr>
-          <w:p>
-            <w:r>
-              <w:rPr>
-                <w:rFonts w:ascii="Arial" w:hAnsi="Arial"/>
-                <w:sz w:val="18"/>
-              </w:rPr>
-              <w:t>0.401</w:t>
-            </w:r>
-          </w:p>
-        </w:tc>
-        <w:tc>
-          <w:tcPr>
-            <w:tcW w:type="dxa" w:w="864"/>
-          </w:tcPr>
-          <w:p>
-            <w:r>
-              <w:rPr>
-                <w:rFonts w:ascii="Arial" w:hAnsi="Arial"/>
-                <w:sz w:val="18"/>
-              </w:rPr>
-              <w:t>-23.758</w:t>
-            </w:r>
-          </w:p>
-        </w:tc>
-        <w:tc>
-          <w:tcPr>
-            <w:tcW w:type="dxa" w:w="864"/>
-          </w:tcPr>
-          <w:p>
-            <w:r>
-              <w:rPr>
-                <w:rFonts w:ascii="Arial" w:hAnsi="Arial"/>
-                <w:sz w:val="18"/>
-              </w:rPr>
-              <w:t>59.429</w:t>
-            </w:r>
-          </w:p>
-        </w:tc>
-        <w:tc>
-          <w:tcPr>
-            <w:tcW w:type="dxa" w:w="864"/>
-          </w:tcPr>
-          <w:p>
-            <w:r>
-              <w:rPr>
-                <w:rFonts w:ascii="Arial" w:hAnsi="Arial"/>
-                <w:sz w:val="18"/>
-              </w:rPr>
-              <w:t>17.200</w:t>
+              <w:t>+17.739</w:t>
+            </w:r>
+          </w:p>
+        </w:tc>
+        <w:tc>
+          <w:tcPr>
+            <w:tcW w:type="dxa" w:w="864"/>
+          </w:tcPr>
+          <w:p>
+            <w:r>
+              <w:rPr>
+                <w:rFonts w:ascii="Arial" w:hAnsi="Arial"/>
+                <w:sz w:val="18"/>
+              </w:rPr>
+              <w:t>21.185</w:t>
+            </w:r>
+          </w:p>
+        </w:tc>
+        <w:tc>
+          <w:tcPr>
+            <w:tcW w:type="dxa" w:w="864"/>
+          </w:tcPr>
+          <w:p>
+            <w:r>
+              <w:rPr>
+                <w:rFonts w:ascii="Arial" w:hAnsi="Arial"/>
+                <w:sz w:val="18"/>
+              </w:rPr>
+              <w:t>0.402</w:t>
+            </w:r>
+          </w:p>
+        </w:tc>
+        <w:tc>
+          <w:tcPr>
+            <w:tcW w:type="dxa" w:w="864"/>
+          </w:tcPr>
+          <w:p>
+            <w:r>
+              <w:rPr>
+                <w:rFonts w:ascii="Arial" w:hAnsi="Arial"/>
+                <w:sz w:val="18"/>
+              </w:rPr>
+              <w:t>-23.782</w:t>
+            </w:r>
+          </w:p>
+        </w:tc>
+        <w:tc>
+          <w:tcPr>
+            <w:tcW w:type="dxa" w:w="864"/>
+          </w:tcPr>
+          <w:p>
+            <w:r>
+              <w:rPr>
+                <w:rFonts w:ascii="Arial" w:hAnsi="Arial"/>
+                <w:sz w:val="18"/>
+              </w:rPr>
+              <w:t>59.260</w:t>
+            </w:r>
+          </w:p>
+        </w:tc>
+        <w:tc>
+          <w:tcPr>
+            <w:tcW w:type="dxa" w:w="864"/>
+          </w:tcPr>
+          <w:p>
+            <w:r>
+              <w:rPr>
+                <w:rFonts w:ascii="Arial" w:hAnsi="Arial"/>
+                <w:sz w:val="18"/>
+              </w:rPr>
+              <w:t>17.400</w:t>
             </w:r>
           </w:p>
         </w:tc>
@@ -19697,77 +19697,77 @@
                 <w:rFonts w:ascii="Arial" w:hAnsi="Arial"/>
                 <w:sz w:val="18"/>
               </w:rPr>
-              <w:t>+21.969</w:t>
-            </w:r>
-          </w:p>
-        </w:tc>
-        <w:tc>
-          <w:tcPr>
-            <w:tcW w:type="dxa" w:w="864"/>
-          </w:tcPr>
-          <w:p>
-            <w:r>
-              <w:rPr>
-                <w:rFonts w:ascii="Arial" w:hAnsi="Arial"/>
-                <w:sz w:val="18"/>
-              </w:rPr>
-              <w:t>19.354</w:t>
-            </w:r>
-          </w:p>
-        </w:tc>
-        <w:tc>
-          <w:tcPr>
-            <w:tcW w:type="dxa" w:w="864"/>
-          </w:tcPr>
-          <w:p>
-            <w:r>
-              <w:rPr>
-                <w:rFonts w:ascii="Arial" w:hAnsi="Arial"/>
-                <w:sz w:val="18"/>
-              </w:rPr>
-              <w:t>0.256</w:t>
-            </w:r>
-          </w:p>
-        </w:tc>
-        <w:tc>
-          <w:tcPr>
-            <w:tcW w:type="dxa" w:w="864"/>
-          </w:tcPr>
-          <w:p>
-            <w:r>
-              <w:rPr>
-                <w:rFonts w:ascii="Arial" w:hAnsi="Arial"/>
-                <w:sz w:val="18"/>
-              </w:rPr>
-              <w:t>-15.965</w:t>
-            </w:r>
-          </w:p>
-        </w:tc>
-        <w:tc>
-          <w:tcPr>
-            <w:tcW w:type="dxa" w:w="864"/>
-          </w:tcPr>
-          <w:p>
-            <w:r>
-              <w:rPr>
-                <w:rFonts w:ascii="Arial" w:hAnsi="Arial"/>
-                <w:sz w:val="18"/>
-              </w:rPr>
-              <w:t>59.903</w:t>
-            </w:r>
-          </w:p>
-        </w:tc>
-        <w:tc>
-          <w:tcPr>
-            <w:tcW w:type="dxa" w:w="864"/>
-          </w:tcPr>
-          <w:p>
-            <w:r>
-              <w:rPr>
-                <w:rFonts w:ascii="Arial" w:hAnsi="Arial"/>
-                <w:sz w:val="18"/>
-              </w:rPr>
-              <w:t>44.400</w:t>
+              <w:t>+21.857</w:t>
+            </w:r>
+          </w:p>
+        </w:tc>
+        <w:tc>
+          <w:tcPr>
+            <w:tcW w:type="dxa" w:w="864"/>
+          </w:tcPr>
+          <w:p>
+            <w:r>
+              <w:rPr>
+                <w:rFonts w:ascii="Arial" w:hAnsi="Arial"/>
+                <w:sz w:val="18"/>
+              </w:rPr>
+              <w:t>19.319</w:t>
+            </w:r>
+          </w:p>
+        </w:tc>
+        <w:tc>
+          <w:tcPr>
+            <w:tcW w:type="dxa" w:w="864"/>
+          </w:tcPr>
+          <w:p>
+            <w:r>
+              <w:rPr>
+                <w:rFonts w:ascii="Arial" w:hAnsi="Arial"/>
+                <w:sz w:val="18"/>
+              </w:rPr>
+              <w:t>0.258</w:t>
+            </w:r>
+          </w:p>
+        </w:tc>
+        <w:tc>
+          <w:tcPr>
+            <w:tcW w:type="dxa" w:w="864"/>
+          </w:tcPr>
+          <w:p>
+            <w:r>
+              <w:rPr>
+                <w:rFonts w:ascii="Arial" w:hAnsi="Arial"/>
+                <w:sz w:val="18"/>
+              </w:rPr>
+              <w:t>-16.007</w:t>
+            </w:r>
+          </w:p>
+        </w:tc>
+        <w:tc>
+          <w:tcPr>
+            <w:tcW w:type="dxa" w:w="864"/>
+          </w:tcPr>
+          <w:p>
+            <w:r>
+              <w:rPr>
+                <w:rFonts w:ascii="Arial" w:hAnsi="Arial"/>
+                <w:sz w:val="18"/>
+              </w:rPr>
+              <w:t>59.722</w:t>
+            </w:r>
+          </w:p>
+        </w:tc>
+        <w:tc>
+          <w:tcPr>
+            <w:tcW w:type="dxa" w:w="864"/>
+          </w:tcPr>
+          <w:p>
+            <w:r>
+              <w:rPr>
+                <w:rFonts w:ascii="Arial" w:hAnsi="Arial"/>
+                <w:sz w:val="18"/>
+              </w:rPr>
+              <w:t>44.700</w:t>
             </w:r>
           </w:p>
         </w:tc>
@@ -19839,77 +19839,77 @@
                 <w:rFonts w:ascii="Arial" w:hAnsi="Arial"/>
                 <w:sz w:val="18"/>
               </w:rPr>
-              <w:t>+22.526</w:t>
-            </w:r>
-          </w:p>
-        </w:tc>
-        <w:tc>
-          <w:tcPr>
-            <w:tcW w:type="dxa" w:w="864"/>
-          </w:tcPr>
-          <w:p>
-            <w:r>
-              <w:rPr>
-                <w:rFonts w:ascii="Arial" w:hAnsi="Arial"/>
-                <w:sz w:val="18"/>
-              </w:rPr>
-              <w:t>18.955</w:t>
-            </w:r>
-          </w:p>
-        </w:tc>
-        <w:tc>
-          <w:tcPr>
-            <w:tcW w:type="dxa" w:w="864"/>
-          </w:tcPr>
-          <w:p>
-            <w:r>
-              <w:rPr>
-                <w:rFonts w:ascii="Arial" w:hAnsi="Arial"/>
-                <w:sz w:val="18"/>
-              </w:rPr>
-              <w:t>0.235</w:t>
-            </w:r>
-          </w:p>
-        </w:tc>
-        <w:tc>
-          <w:tcPr>
-            <w:tcW w:type="dxa" w:w="864"/>
-          </w:tcPr>
-          <w:p>
-            <w:r>
-              <w:rPr>
-                <w:rFonts w:ascii="Arial" w:hAnsi="Arial"/>
-                <w:sz w:val="18"/>
-              </w:rPr>
-              <w:t>-14.625</w:t>
-            </w:r>
-          </w:p>
-        </w:tc>
-        <w:tc>
-          <w:tcPr>
-            <w:tcW w:type="dxa" w:w="864"/>
-          </w:tcPr>
-          <w:p>
-            <w:r>
-              <w:rPr>
-                <w:rFonts w:ascii="Arial" w:hAnsi="Arial"/>
-                <w:sz w:val="18"/>
-              </w:rPr>
-              <w:t>59.676</w:t>
-            </w:r>
-          </w:p>
-        </w:tc>
-        <w:tc>
-          <w:tcPr>
-            <w:tcW w:type="dxa" w:w="864"/>
-          </w:tcPr>
-          <w:p>
-            <w:r>
-              <w:rPr>
-                <w:rFonts w:ascii="Arial" w:hAnsi="Arial"/>
-                <w:sz w:val="18"/>
-              </w:rPr>
-              <w:t>48.000</w:t>
+              <w:t>+22.392</w:t>
+            </w:r>
+          </w:p>
+        </w:tc>
+        <w:tc>
+          <w:tcPr>
+            <w:tcW w:type="dxa" w:w="864"/>
+          </w:tcPr>
+          <w:p>
+            <w:r>
+              <w:rPr>
+                <w:rFonts w:ascii="Arial" w:hAnsi="Arial"/>
+                <w:sz w:val="18"/>
+              </w:rPr>
+              <w:t>18.935</w:t>
+            </w:r>
+          </w:p>
+        </w:tc>
+        <w:tc>
+          <w:tcPr>
+            <w:tcW w:type="dxa" w:w="864"/>
+          </w:tcPr>
+          <w:p>
+            <w:r>
+              <w:rPr>
+                <w:rFonts w:ascii="Arial" w:hAnsi="Arial"/>
+                <w:sz w:val="18"/>
+              </w:rPr>
+              <w:t>0.237</w:t>
+            </w:r>
+          </w:p>
+        </w:tc>
+        <w:tc>
+          <w:tcPr>
+            <w:tcW w:type="dxa" w:w="864"/>
+          </w:tcPr>
+          <w:p>
+            <w:r>
+              <w:rPr>
+                <w:rFonts w:ascii="Arial" w:hAnsi="Arial"/>
+                <w:sz w:val="18"/>
+              </w:rPr>
+              <w:t>-14.720</w:t>
+            </w:r>
+          </w:p>
+        </w:tc>
+        <w:tc>
+          <w:tcPr>
+            <w:tcW w:type="dxa" w:w="864"/>
+          </w:tcPr>
+          <w:p>
+            <w:r>
+              <w:rPr>
+                <w:rFonts w:ascii="Arial" w:hAnsi="Arial"/>
+                <w:sz w:val="18"/>
+              </w:rPr>
+              <w:t>59.504</w:t>
+            </w:r>
+          </w:p>
+        </w:tc>
+        <w:tc>
+          <w:tcPr>
+            <w:tcW w:type="dxa" w:w="864"/>
+          </w:tcPr>
+          <w:p>
+            <w:r>
+              <w:rPr>
+                <w:rFonts w:ascii="Arial" w:hAnsi="Arial"/>
+                <w:sz w:val="18"/>
+              </w:rPr>
+              <w:t>48.200</w:t>
             </w:r>
           </w:p>
         </w:tc>
@@ -19981,77 +19981,77 @@
                 <w:rFonts w:ascii="Arial" w:hAnsi="Arial"/>
                 <w:sz w:val="18"/>
               </w:rPr>
-              <w:t>-2.618</w:t>
-            </w:r>
-          </w:p>
-        </w:tc>
-        <w:tc>
-          <w:tcPr>
-            <w:tcW w:type="dxa" w:w="864"/>
-          </w:tcPr>
-          <w:p>
-            <w:r>
-              <w:rPr>
-                <w:rFonts w:ascii="Arial" w:hAnsi="Arial"/>
-                <w:sz w:val="18"/>
-              </w:rPr>
-              <w:t>3.408</w:t>
-            </w:r>
-          </w:p>
-        </w:tc>
-        <w:tc>
-          <w:tcPr>
-            <w:tcW w:type="dxa" w:w="864"/>
-          </w:tcPr>
-          <w:p>
-            <w:r>
-              <w:rPr>
-                <w:rFonts w:ascii="Arial" w:hAnsi="Arial"/>
-                <w:sz w:val="18"/>
-              </w:rPr>
-              <w:t>0.442</w:t>
-            </w:r>
-          </w:p>
-        </w:tc>
-        <w:tc>
-          <w:tcPr>
-            <w:tcW w:type="dxa" w:w="864"/>
-          </w:tcPr>
-          <w:p>
-            <w:r>
-              <w:rPr>
-                <w:rFonts w:ascii="Arial" w:hAnsi="Arial"/>
-                <w:sz w:val="18"/>
-              </w:rPr>
-              <w:t>-9.298</w:t>
-            </w:r>
-          </w:p>
-        </w:tc>
-        <w:tc>
-          <w:tcPr>
-            <w:tcW w:type="dxa" w:w="864"/>
-          </w:tcPr>
-          <w:p>
-            <w:r>
-              <w:rPr>
-                <w:rFonts w:ascii="Arial" w:hAnsi="Arial"/>
-                <w:sz w:val="18"/>
-              </w:rPr>
-              <w:t>4.062</w:t>
-            </w:r>
-          </w:p>
-        </w:tc>
-        <w:tc>
-          <w:tcPr>
-            <w:tcW w:type="dxa" w:w="864"/>
-          </w:tcPr>
-          <w:p>
-            <w:r>
-              <w:rPr>
-                <w:rFonts w:ascii="Arial" w:hAnsi="Arial"/>
-                <w:sz w:val="18"/>
-              </w:rPr>
-              <w:t>27.700</w:t>
+              <w:t>-2.672</w:t>
+            </w:r>
+          </w:p>
+        </w:tc>
+        <w:tc>
+          <w:tcPr>
+            <w:tcW w:type="dxa" w:w="864"/>
+          </w:tcPr>
+          <w:p>
+            <w:r>
+              <w:rPr>
+                <w:rFonts w:ascii="Arial" w:hAnsi="Arial"/>
+                <w:sz w:val="18"/>
+              </w:rPr>
+              <w:t>3.414</w:t>
+            </w:r>
+          </w:p>
+        </w:tc>
+        <w:tc>
+          <w:tcPr>
+            <w:tcW w:type="dxa" w:w="864"/>
+          </w:tcPr>
+          <w:p>
+            <w:r>
+              <w:rPr>
+                <w:rFonts w:ascii="Arial" w:hAnsi="Arial"/>
+                <w:sz w:val="18"/>
+              </w:rPr>
+              <w:t>0.434</w:t>
+            </w:r>
+          </w:p>
+        </w:tc>
+        <w:tc>
+          <w:tcPr>
+            <w:tcW w:type="dxa" w:w="864"/>
+          </w:tcPr>
+          <w:p>
+            <w:r>
+              <w:rPr>
+                <w:rFonts w:ascii="Arial" w:hAnsi="Arial"/>
+                <w:sz w:val="18"/>
+              </w:rPr>
+              <w:t>-9.363</w:t>
+            </w:r>
+          </w:p>
+        </w:tc>
+        <w:tc>
+          <w:tcPr>
+            <w:tcW w:type="dxa" w:w="864"/>
+          </w:tcPr>
+          <w:p>
+            <w:r>
+              <w:rPr>
+                <w:rFonts w:ascii="Arial" w:hAnsi="Arial"/>
+                <w:sz w:val="18"/>
+              </w:rPr>
+              <w:t>4.020</w:t>
+            </w:r>
+          </w:p>
+        </w:tc>
+        <w:tc>
+          <w:tcPr>
+            <w:tcW w:type="dxa" w:w="864"/>
+          </w:tcPr>
+          <w:p>
+            <w:r>
+              <w:rPr>
+                <w:rFonts w:ascii="Arial" w:hAnsi="Arial"/>
+                <w:sz w:val="18"/>
+              </w:rPr>
+              <w:t>27.300</w:t>
             </w:r>
           </w:p>
         </w:tc>
@@ -20123,77 +20123,77 @@
                 <w:rFonts w:ascii="Arial" w:hAnsi="Arial"/>
                 <w:sz w:val="18"/>
               </w:rPr>
-              <w:t>-3.529</w:t>
-            </w:r>
-          </w:p>
-        </w:tc>
-        <w:tc>
-          <w:tcPr>
-            <w:tcW w:type="dxa" w:w="864"/>
-          </w:tcPr>
-          <w:p>
-            <w:r>
-              <w:rPr>
-                <w:rFonts w:ascii="Arial" w:hAnsi="Arial"/>
-                <w:sz w:val="18"/>
-              </w:rPr>
-              <w:t>3.352</w:t>
-            </w:r>
-          </w:p>
-        </w:tc>
-        <w:tc>
-          <w:tcPr>
-            <w:tcW w:type="dxa" w:w="864"/>
-          </w:tcPr>
-          <w:p>
-            <w:r>
-              <w:rPr>
-                <w:rFonts w:ascii="Arial" w:hAnsi="Arial"/>
-                <w:sz w:val="18"/>
-              </w:rPr>
-              <w:t>0.292</w:t>
-            </w:r>
-          </w:p>
-        </w:tc>
-        <w:tc>
-          <w:tcPr>
-            <w:tcW w:type="dxa" w:w="864"/>
-          </w:tcPr>
-          <w:p>
-            <w:r>
-              <w:rPr>
-                <w:rFonts w:ascii="Arial" w:hAnsi="Arial"/>
-                <w:sz w:val="18"/>
-              </w:rPr>
-              <w:t>-10.099</w:t>
-            </w:r>
-          </w:p>
-        </w:tc>
-        <w:tc>
-          <w:tcPr>
-            <w:tcW w:type="dxa" w:w="864"/>
-          </w:tcPr>
-          <w:p>
-            <w:r>
-              <w:rPr>
-                <w:rFonts w:ascii="Arial" w:hAnsi="Arial"/>
-                <w:sz w:val="18"/>
-              </w:rPr>
-              <w:t>3.040</w:t>
-            </w:r>
-          </w:p>
-        </w:tc>
-        <w:tc>
-          <w:tcPr>
-            <w:tcW w:type="dxa" w:w="864"/>
-          </w:tcPr>
-          <w:p>
-            <w:r>
-              <w:rPr>
-                <w:rFonts w:ascii="Arial" w:hAnsi="Arial"/>
-                <w:sz w:val="18"/>
-              </w:rPr>
-              <w:t>2.600</w:t>
+              <w:t>-3.593</w:t>
+            </w:r>
+          </w:p>
+        </w:tc>
+        <w:tc>
+          <w:tcPr>
+            <w:tcW w:type="dxa" w:w="864"/>
+          </w:tcPr>
+          <w:p>
+            <w:r>
+              <w:rPr>
+                <w:rFonts w:ascii="Arial" w:hAnsi="Arial"/>
+                <w:sz w:val="18"/>
+              </w:rPr>
+              <w:t>3.362</w:t>
+            </w:r>
+          </w:p>
+        </w:tc>
+        <w:tc>
+          <w:tcPr>
+            <w:tcW w:type="dxa" w:w="864"/>
+          </w:tcPr>
+          <w:p>
+            <w:r>
+              <w:rPr>
+                <w:rFonts w:ascii="Arial" w:hAnsi="Arial"/>
+                <w:sz w:val="18"/>
+              </w:rPr>
+              <w:t>0.285</w:t>
+            </w:r>
+          </w:p>
+        </w:tc>
+        <w:tc>
+          <w:tcPr>
+            <w:tcW w:type="dxa" w:w="864"/>
+          </w:tcPr>
+          <w:p>
+            <w:r>
+              <w:rPr>
+                <w:rFonts w:ascii="Arial" w:hAnsi="Arial"/>
+                <w:sz w:val="18"/>
+              </w:rPr>
+              <w:t>-10.182</w:t>
+            </w:r>
+          </w:p>
+        </w:tc>
+        <w:tc>
+          <w:tcPr>
+            <w:tcW w:type="dxa" w:w="864"/>
+          </w:tcPr>
+          <w:p>
+            <w:r>
+              <w:rPr>
+                <w:rFonts w:ascii="Arial" w:hAnsi="Arial"/>
+                <w:sz w:val="18"/>
+              </w:rPr>
+              <w:t>2.996</w:t>
+            </w:r>
+          </w:p>
+        </w:tc>
+        <w:tc>
+          <w:tcPr>
+            <w:tcW w:type="dxa" w:w="864"/>
+          </w:tcPr>
+          <w:p>
+            <w:r>
+              <w:rPr>
+                <w:rFonts w:ascii="Arial" w:hAnsi="Arial"/>
+                <w:sz w:val="18"/>
+              </w:rPr>
+              <w:t>2.300</w:t>
             </w:r>
           </w:p>
         </w:tc>
@@ -20265,77 +20265,77 @@
                 <w:rFonts w:ascii="Arial" w:hAnsi="Arial"/>
                 <w:sz w:val="18"/>
               </w:rPr>
-              <w:t>-1.966</w:t>
-            </w:r>
-          </w:p>
-        </w:tc>
-        <w:tc>
-          <w:tcPr>
-            <w:tcW w:type="dxa" w:w="864"/>
-          </w:tcPr>
-          <w:p>
-            <w:r>
-              <w:rPr>
-                <w:rFonts w:ascii="Arial" w:hAnsi="Arial"/>
-                <w:sz w:val="18"/>
-              </w:rPr>
-              <w:t>2.424</w:t>
-            </w:r>
-          </w:p>
-        </w:tc>
-        <w:tc>
-          <w:tcPr>
-            <w:tcW w:type="dxa" w:w="864"/>
-          </w:tcPr>
-          <w:p>
-            <w:r>
-              <w:rPr>
-                <w:rFonts w:ascii="Arial" w:hAnsi="Arial"/>
-                <w:sz w:val="18"/>
-              </w:rPr>
-              <w:t>0.417</w:t>
-            </w:r>
-          </w:p>
-        </w:tc>
-        <w:tc>
-          <w:tcPr>
-            <w:tcW w:type="dxa" w:w="864"/>
-          </w:tcPr>
-          <w:p>
-            <w:r>
-              <w:rPr>
-                <w:rFonts w:ascii="Arial" w:hAnsi="Arial"/>
-                <w:sz w:val="18"/>
-              </w:rPr>
-              <w:t>-6.717</w:t>
-            </w:r>
-          </w:p>
-        </w:tc>
-        <w:tc>
-          <w:tcPr>
-            <w:tcW w:type="dxa" w:w="864"/>
-          </w:tcPr>
-          <w:p>
-            <w:r>
-              <w:rPr>
-                <w:rFonts w:ascii="Arial" w:hAnsi="Arial"/>
-                <w:sz w:val="18"/>
-              </w:rPr>
-              <w:t>2.786</w:t>
-            </w:r>
-          </w:p>
-        </w:tc>
-        <w:tc>
-          <w:tcPr>
-            <w:tcW w:type="dxa" w:w="864"/>
-          </w:tcPr>
-          <w:p>
-            <w:r>
-              <w:rPr>
-                <w:rFonts w:ascii="Arial" w:hAnsi="Arial"/>
-                <w:sz w:val="18"/>
-              </w:rPr>
-              <w:t>45.700</w:t>
+              <w:t>-2.002</w:t>
+            </w:r>
+          </w:p>
+        </w:tc>
+        <w:tc>
+          <w:tcPr>
+            <w:tcW w:type="dxa" w:w="864"/>
+          </w:tcPr>
+          <w:p>
+            <w:r>
+              <w:rPr>
+                <w:rFonts w:ascii="Arial" w:hAnsi="Arial"/>
+                <w:sz w:val="18"/>
+              </w:rPr>
+              <w:t>2.415</w:t>
+            </w:r>
+          </w:p>
+        </w:tc>
+        <w:tc>
+          <w:tcPr>
+            <w:tcW w:type="dxa" w:w="864"/>
+          </w:tcPr>
+          <w:p>
+            <w:r>
+              <w:rPr>
+                <w:rFonts w:ascii="Arial" w:hAnsi="Arial"/>
+                <w:sz w:val="18"/>
+              </w:rPr>
+              <w:t>0.407</w:t>
+            </w:r>
+          </w:p>
+        </w:tc>
+        <w:tc>
+          <w:tcPr>
+            <w:tcW w:type="dxa" w:w="864"/>
+          </w:tcPr>
+          <w:p>
+            <w:r>
+              <w:rPr>
+                <w:rFonts w:ascii="Arial" w:hAnsi="Arial"/>
+                <w:sz w:val="18"/>
+              </w:rPr>
+              <w:t>-6.736</w:t>
+            </w:r>
+          </w:p>
+        </w:tc>
+        <w:tc>
+          <w:tcPr>
+            <w:tcW w:type="dxa" w:w="864"/>
+          </w:tcPr>
+          <w:p>
+            <w:r>
+              <w:rPr>
+                <w:rFonts w:ascii="Arial" w:hAnsi="Arial"/>
+                <w:sz w:val="18"/>
+              </w:rPr>
+              <w:t>2.731</w:t>
+            </w:r>
+          </w:p>
+        </w:tc>
+        <w:tc>
+          <w:tcPr>
+            <w:tcW w:type="dxa" w:w="864"/>
+          </w:tcPr>
+          <w:p>
+            <w:r>
+              <w:rPr>
+                <w:rFonts w:ascii="Arial" w:hAnsi="Arial"/>
+                <w:sz w:val="18"/>
+              </w:rPr>
+              <w:t>45.500</w:t>
             </w:r>
           </w:p>
         </w:tc>
@@ -20407,21 +20407,21 @@
                 <w:rFonts w:ascii="Arial" w:hAnsi="Arial"/>
                 <w:sz w:val="18"/>
               </w:rPr>
-              <w:t>-5.633</w:t>
-            </w:r>
-          </w:p>
-        </w:tc>
-        <w:tc>
-          <w:tcPr>
-            <w:tcW w:type="dxa" w:w="864"/>
-          </w:tcPr>
-          <w:p>
-            <w:r>
-              <w:rPr>
-                <w:rFonts w:ascii="Arial" w:hAnsi="Arial"/>
-                <w:sz w:val="18"/>
-              </w:rPr>
-              <w:t>2.122</w:t>
+              <w:t>-5.687</w:t>
+            </w:r>
+          </w:p>
+        </w:tc>
+        <w:tc>
+          <w:tcPr>
+            <w:tcW w:type="dxa" w:w="864"/>
+          </w:tcPr>
+          <w:p>
+            <w:r>
+              <w:rPr>
+                <w:rFonts w:ascii="Arial" w:hAnsi="Arial"/>
+                <w:sz w:val="18"/>
+              </w:rPr>
+              <w:t>2.132</w:t>
             </w:r>
           </w:p>
         </w:tc>
@@ -20449,35 +20449,35 @@
                 <w:rFonts w:ascii="Arial" w:hAnsi="Arial"/>
                 <w:sz w:val="18"/>
               </w:rPr>
-              <w:t>-9.793</w:t>
-            </w:r>
-          </w:p>
-        </w:tc>
-        <w:tc>
-          <w:tcPr>
-            <w:tcW w:type="dxa" w:w="864"/>
-          </w:tcPr>
-          <w:p>
-            <w:r>
-              <w:rPr>
-                <w:rFonts w:ascii="Arial" w:hAnsi="Arial"/>
-                <w:sz w:val="18"/>
-              </w:rPr>
-              <w:t>-1.474</w:t>
-            </w:r>
-          </w:p>
-        </w:tc>
-        <w:tc>
-          <w:tcPr>
-            <w:tcW w:type="dxa" w:w="864"/>
-          </w:tcPr>
-          <w:p>
-            <w:r>
-              <w:rPr>
-                <w:rFonts w:ascii="Arial" w:hAnsi="Arial"/>
-                <w:sz w:val="18"/>
-              </w:rPr>
-              <w:t>-55.500</w:t>
+              <w:t>-9.865</w:t>
+            </w:r>
+          </w:p>
+        </w:tc>
+        <w:tc>
+          <w:tcPr>
+            <w:tcW w:type="dxa" w:w="864"/>
+          </w:tcPr>
+          <w:p>
+            <w:r>
+              <w:rPr>
+                <w:rFonts w:ascii="Arial" w:hAnsi="Arial"/>
+                <w:sz w:val="18"/>
+              </w:rPr>
+              <w:t>-1.509</w:t>
+            </w:r>
+          </w:p>
+        </w:tc>
+        <w:tc>
+          <w:tcPr>
+            <w:tcW w:type="dxa" w:w="864"/>
+          </w:tcPr>
+          <w:p>
+            <w:r>
+              <w:rPr>
+                <w:rFonts w:ascii="Arial" w:hAnsi="Arial"/>
+                <w:sz w:val="18"/>
+              </w:rPr>
+              <w:t>-54.700</w:t>
             </w:r>
           </w:p>
         </w:tc>
@@ -20549,77 +20549,77 @@
                 <w:rFonts w:ascii="Arial" w:hAnsi="Arial"/>
                 <w:sz w:val="18"/>
               </w:rPr>
-              <w:t>-2.618</w:t>
-            </w:r>
-          </w:p>
-        </w:tc>
-        <w:tc>
-          <w:tcPr>
-            <w:tcW w:type="dxa" w:w="864"/>
-          </w:tcPr>
-          <w:p>
-            <w:r>
-              <w:rPr>
-                <w:rFonts w:ascii="Arial" w:hAnsi="Arial"/>
-                <w:sz w:val="18"/>
-              </w:rPr>
-              <w:t>3.408</w:t>
-            </w:r>
-          </w:p>
-        </w:tc>
-        <w:tc>
-          <w:tcPr>
-            <w:tcW w:type="dxa" w:w="864"/>
-          </w:tcPr>
-          <w:p>
-            <w:r>
-              <w:rPr>
-                <w:rFonts w:ascii="Arial" w:hAnsi="Arial"/>
-                <w:sz w:val="18"/>
-              </w:rPr>
-              <w:t>0.442</w:t>
-            </w:r>
-          </w:p>
-        </w:tc>
-        <w:tc>
-          <w:tcPr>
-            <w:tcW w:type="dxa" w:w="864"/>
-          </w:tcPr>
-          <w:p>
-            <w:r>
-              <w:rPr>
-                <w:rFonts w:ascii="Arial" w:hAnsi="Arial"/>
-                <w:sz w:val="18"/>
-              </w:rPr>
-              <w:t>-9.298</w:t>
-            </w:r>
-          </w:p>
-        </w:tc>
-        <w:tc>
-          <w:tcPr>
-            <w:tcW w:type="dxa" w:w="864"/>
-          </w:tcPr>
-          <w:p>
-            <w:r>
-              <w:rPr>
-                <w:rFonts w:ascii="Arial" w:hAnsi="Arial"/>
-                <w:sz w:val="18"/>
-              </w:rPr>
-              <w:t>4.062</w:t>
-            </w:r>
-          </w:p>
-        </w:tc>
-        <w:tc>
-          <w:tcPr>
-            <w:tcW w:type="dxa" w:w="864"/>
-          </w:tcPr>
-          <w:p>
-            <w:r>
-              <w:rPr>
-                <w:rFonts w:ascii="Arial" w:hAnsi="Arial"/>
-                <w:sz w:val="18"/>
-              </w:rPr>
-              <w:t>27.700</w:t>
+              <w:t>-2.672</w:t>
+            </w:r>
+          </w:p>
+        </w:tc>
+        <w:tc>
+          <w:tcPr>
+            <w:tcW w:type="dxa" w:w="864"/>
+          </w:tcPr>
+          <w:p>
+            <w:r>
+              <w:rPr>
+                <w:rFonts w:ascii="Arial" w:hAnsi="Arial"/>
+                <w:sz w:val="18"/>
+              </w:rPr>
+              <w:t>3.414</w:t>
+            </w:r>
+          </w:p>
+        </w:tc>
+        <w:tc>
+          <w:tcPr>
+            <w:tcW w:type="dxa" w:w="864"/>
+          </w:tcPr>
+          <w:p>
+            <w:r>
+              <w:rPr>
+                <w:rFonts w:ascii="Arial" w:hAnsi="Arial"/>
+                <w:sz w:val="18"/>
+              </w:rPr>
+              <w:t>0.434</w:t>
+            </w:r>
+          </w:p>
+        </w:tc>
+        <w:tc>
+          <w:tcPr>
+            <w:tcW w:type="dxa" w:w="864"/>
+          </w:tcPr>
+          <w:p>
+            <w:r>
+              <w:rPr>
+                <w:rFonts w:ascii="Arial" w:hAnsi="Arial"/>
+                <w:sz w:val="18"/>
+              </w:rPr>
+              <w:t>-9.363</w:t>
+            </w:r>
+          </w:p>
+        </w:tc>
+        <w:tc>
+          <w:tcPr>
+            <w:tcW w:type="dxa" w:w="864"/>
+          </w:tcPr>
+          <w:p>
+            <w:r>
+              <w:rPr>
+                <w:rFonts w:ascii="Arial" w:hAnsi="Arial"/>
+                <w:sz w:val="18"/>
+              </w:rPr>
+              <w:t>4.020</w:t>
+            </w:r>
+          </w:p>
+        </w:tc>
+        <w:tc>
+          <w:tcPr>
+            <w:tcW w:type="dxa" w:w="864"/>
+          </w:tcPr>
+          <w:p>
+            <w:r>
+              <w:rPr>
+                <w:rFonts w:ascii="Arial" w:hAnsi="Arial"/>
+                <w:sz w:val="18"/>
+              </w:rPr>
+              <w:t>27.300</w:t>
             </w:r>
           </w:p>
         </w:tc>
@@ -20691,77 +20691,77 @@
                 <w:rFonts w:ascii="Arial" w:hAnsi="Arial"/>
                 <w:sz w:val="18"/>
               </w:rPr>
-              <w:t>-4.553</w:t>
-            </w:r>
-          </w:p>
-        </w:tc>
-        <w:tc>
-          <w:tcPr>
-            <w:tcW w:type="dxa" w:w="864"/>
-          </w:tcPr>
-          <w:p>
-            <w:r>
-              <w:rPr>
-                <w:rFonts w:ascii="Arial" w:hAnsi="Arial"/>
-                <w:sz w:val="18"/>
-              </w:rPr>
-              <w:t>3.092</w:t>
-            </w:r>
-          </w:p>
-        </w:tc>
-        <w:tc>
-          <w:tcPr>
-            <w:tcW w:type="dxa" w:w="864"/>
-          </w:tcPr>
-          <w:p>
-            <w:r>
-              <w:rPr>
-                <w:rFonts w:ascii="Arial" w:hAnsi="Arial"/>
-                <w:sz w:val="18"/>
-              </w:rPr>
-              <w:t>0.141</w:t>
-            </w:r>
-          </w:p>
-        </w:tc>
-        <w:tc>
-          <w:tcPr>
-            <w:tcW w:type="dxa" w:w="864"/>
-          </w:tcPr>
-          <w:p>
-            <w:r>
-              <w:rPr>
-                <w:rFonts w:ascii="Arial" w:hAnsi="Arial"/>
-                <w:sz w:val="18"/>
-              </w:rPr>
-              <w:t>-10.613</w:t>
-            </w:r>
-          </w:p>
-        </w:tc>
-        <w:tc>
-          <w:tcPr>
-            <w:tcW w:type="dxa" w:w="864"/>
-          </w:tcPr>
-          <w:p>
-            <w:r>
-              <w:rPr>
-                <w:rFonts w:ascii="Arial" w:hAnsi="Arial"/>
-                <w:sz w:val="18"/>
-              </w:rPr>
-              <w:t>1.508</w:t>
-            </w:r>
-          </w:p>
-        </w:tc>
-        <w:tc>
-          <w:tcPr>
-            <w:tcW w:type="dxa" w:w="864"/>
-          </w:tcPr>
-          <w:p>
-            <w:r>
-              <w:rPr>
-                <w:rFonts w:ascii="Arial" w:hAnsi="Arial"/>
-                <w:sz w:val="18"/>
-              </w:rPr>
-              <w:t>-25.600</w:t>
+              <w:t>-4.600</w:t>
+            </w:r>
+          </w:p>
+        </w:tc>
+        <w:tc>
+          <w:tcPr>
+            <w:tcW w:type="dxa" w:w="864"/>
+          </w:tcPr>
+          <w:p>
+            <w:r>
+              <w:rPr>
+                <w:rFonts w:ascii="Arial" w:hAnsi="Arial"/>
+                <w:sz w:val="18"/>
+              </w:rPr>
+              <w:t>3.106</w:t>
+            </w:r>
+          </w:p>
+        </w:tc>
+        <w:tc>
+          <w:tcPr>
+            <w:tcW w:type="dxa" w:w="864"/>
+          </w:tcPr>
+          <w:p>
+            <w:r>
+              <w:rPr>
+                <w:rFonts w:ascii="Arial" w:hAnsi="Arial"/>
+                <w:sz w:val="18"/>
+              </w:rPr>
+              <w:t>0.139</w:t>
+            </w:r>
+          </w:p>
+        </w:tc>
+        <w:tc>
+          <w:tcPr>
+            <w:tcW w:type="dxa" w:w="864"/>
+          </w:tcPr>
+          <w:p>
+            <w:r>
+              <w:rPr>
+                <w:rFonts w:ascii="Arial" w:hAnsi="Arial"/>
+                <w:sz w:val="18"/>
+              </w:rPr>
+              <w:t>-10.688</w:t>
+            </w:r>
+          </w:p>
+        </w:tc>
+        <w:tc>
+          <w:tcPr>
+            <w:tcW w:type="dxa" w:w="864"/>
+          </w:tcPr>
+          <w:p>
+            <w:r>
+              <w:rPr>
+                <w:rFonts w:ascii="Arial" w:hAnsi="Arial"/>
+                <w:sz w:val="18"/>
+              </w:rPr>
+              <w:t>1.488</w:t>
+            </w:r>
+          </w:p>
+        </w:tc>
+        <w:tc>
+          <w:tcPr>
+            <w:tcW w:type="dxa" w:w="864"/>
+          </w:tcPr>
+          <w:p>
+            <w:r>
+              <w:rPr>
+                <w:rFonts w:ascii="Arial" w:hAnsi="Arial"/>
+                <w:sz w:val="18"/>
+              </w:rPr>
+              <w:t>-25.100</w:t>
             </w:r>
           </w:p>
         </w:tc>
@@ -20833,77 +20833,77 @@
                 <w:rFonts w:ascii="Arial" w:hAnsi="Arial"/>
                 <w:sz w:val="18"/>
               </w:rPr>
-              <w:t>-4.553</w:t>
-            </w:r>
-          </w:p>
-        </w:tc>
-        <w:tc>
-          <w:tcPr>
-            <w:tcW w:type="dxa" w:w="864"/>
-          </w:tcPr>
-          <w:p>
-            <w:r>
-              <w:rPr>
-                <w:rFonts w:ascii="Arial" w:hAnsi="Arial"/>
-                <w:sz w:val="18"/>
-              </w:rPr>
-              <w:t>3.092</w:t>
-            </w:r>
-          </w:p>
-        </w:tc>
-        <w:tc>
-          <w:tcPr>
-            <w:tcW w:type="dxa" w:w="864"/>
-          </w:tcPr>
-          <w:p>
-            <w:r>
-              <w:rPr>
-                <w:rFonts w:ascii="Arial" w:hAnsi="Arial"/>
-                <w:sz w:val="18"/>
-              </w:rPr>
-              <w:t>0.141</w:t>
-            </w:r>
-          </w:p>
-        </w:tc>
-        <w:tc>
-          <w:tcPr>
-            <w:tcW w:type="dxa" w:w="864"/>
-          </w:tcPr>
-          <w:p>
-            <w:r>
-              <w:rPr>
-                <w:rFonts w:ascii="Arial" w:hAnsi="Arial"/>
-                <w:sz w:val="18"/>
-              </w:rPr>
-              <w:t>-10.613</w:t>
-            </w:r>
-          </w:p>
-        </w:tc>
-        <w:tc>
-          <w:tcPr>
-            <w:tcW w:type="dxa" w:w="864"/>
-          </w:tcPr>
-          <w:p>
-            <w:r>
-              <w:rPr>
-                <w:rFonts w:ascii="Arial" w:hAnsi="Arial"/>
-                <w:sz w:val="18"/>
-              </w:rPr>
-              <w:t>1.507</w:t>
-            </w:r>
-          </w:p>
-        </w:tc>
-        <w:tc>
-          <w:tcPr>
-            <w:tcW w:type="dxa" w:w="864"/>
-          </w:tcPr>
-          <w:p>
-            <w:r>
-              <w:rPr>
-                <w:rFonts w:ascii="Arial" w:hAnsi="Arial"/>
-                <w:sz w:val="18"/>
-              </w:rPr>
-              <w:t>-25.700</w:t>
+              <w:t>-4.607</w:t>
+            </w:r>
+          </w:p>
+        </w:tc>
+        <w:tc>
+          <w:tcPr>
+            <w:tcW w:type="dxa" w:w="864"/>
+          </w:tcPr>
+          <w:p>
+            <w:r>
+              <w:rPr>
+                <w:rFonts w:ascii="Arial" w:hAnsi="Arial"/>
+                <w:sz w:val="18"/>
+              </w:rPr>
+              <w:t>3.102</w:t>
+            </w:r>
+          </w:p>
+        </w:tc>
+        <w:tc>
+          <w:tcPr>
+            <w:tcW w:type="dxa" w:w="864"/>
+          </w:tcPr>
+          <w:p>
+            <w:r>
+              <w:rPr>
+                <w:rFonts w:ascii="Arial" w:hAnsi="Arial"/>
+                <w:sz w:val="18"/>
+              </w:rPr>
+              <w:t>0.138</w:t>
+            </w:r>
+          </w:p>
+        </w:tc>
+        <w:tc>
+          <w:tcPr>
+            <w:tcW w:type="dxa" w:w="864"/>
+          </w:tcPr>
+          <w:p>
+            <w:r>
+              <w:rPr>
+                <w:rFonts w:ascii="Arial" w:hAnsi="Arial"/>
+                <w:sz w:val="18"/>
+              </w:rPr>
+              <w:t>-10.687</w:t>
+            </w:r>
+          </w:p>
+        </w:tc>
+        <w:tc>
+          <w:tcPr>
+            <w:tcW w:type="dxa" w:w="864"/>
+          </w:tcPr>
+          <w:p>
+            <w:r>
+              <w:rPr>
+                <w:rFonts w:ascii="Arial" w:hAnsi="Arial"/>
+                <w:sz w:val="18"/>
+              </w:rPr>
+              <w:t>1.473</w:t>
+            </w:r>
+          </w:p>
+        </w:tc>
+        <w:tc>
+          <w:tcPr>
+            <w:tcW w:type="dxa" w:w="864"/>
+          </w:tcPr>
+          <w:p>
+            <w:r>
+              <w:rPr>
+                <w:rFonts w:ascii="Arial" w:hAnsi="Arial"/>
+                <w:sz w:val="18"/>
+              </w:rPr>
+              <w:t>-25.300</w:t>
             </w:r>
           </w:p>
         </w:tc>
@@ -20975,77 +20975,77 @@
                 <w:rFonts w:ascii="Arial" w:hAnsi="Arial"/>
                 <w:sz w:val="18"/>
               </w:rPr>
-              <w:t>-3.516</w:t>
-            </w:r>
-          </w:p>
-        </w:tc>
-        <w:tc>
-          <w:tcPr>
-            <w:tcW w:type="dxa" w:w="864"/>
-          </w:tcPr>
-          <w:p>
-            <w:r>
-              <w:rPr>
-                <w:rFonts w:ascii="Arial" w:hAnsi="Arial"/>
-                <w:sz w:val="18"/>
-              </w:rPr>
-              <w:t>3.351</w:t>
-            </w:r>
-          </w:p>
-        </w:tc>
-        <w:tc>
-          <w:tcPr>
-            <w:tcW w:type="dxa" w:w="864"/>
-          </w:tcPr>
-          <w:p>
-            <w:r>
-              <w:rPr>
-                <w:rFonts w:ascii="Arial" w:hAnsi="Arial"/>
-                <w:sz w:val="18"/>
-              </w:rPr>
-              <w:t>0.294</w:t>
-            </w:r>
-          </w:p>
-        </w:tc>
-        <w:tc>
-          <w:tcPr>
-            <w:tcW w:type="dxa" w:w="864"/>
-          </w:tcPr>
-          <w:p>
-            <w:r>
-              <w:rPr>
-                <w:rFonts w:ascii="Arial" w:hAnsi="Arial"/>
-                <w:sz w:val="18"/>
-              </w:rPr>
-              <w:t>-10.084</w:t>
-            </w:r>
-          </w:p>
-        </w:tc>
-        <w:tc>
-          <w:tcPr>
-            <w:tcW w:type="dxa" w:w="864"/>
-          </w:tcPr>
-          <w:p>
-            <w:r>
-              <w:rPr>
-                <w:rFonts w:ascii="Arial" w:hAnsi="Arial"/>
-                <w:sz w:val="18"/>
-              </w:rPr>
-              <w:t>3.052</w:t>
-            </w:r>
-          </w:p>
-        </w:tc>
-        <w:tc>
-          <w:tcPr>
-            <w:tcW w:type="dxa" w:w="864"/>
-          </w:tcPr>
-          <w:p>
-            <w:r>
-              <w:rPr>
-                <w:rFonts w:ascii="Arial" w:hAnsi="Arial"/>
-                <w:sz w:val="18"/>
-              </w:rPr>
-              <w:t>3.000</w:t>
+              <w:t>-3.581</w:t>
+            </w:r>
+          </w:p>
+        </w:tc>
+        <w:tc>
+          <w:tcPr>
+            <w:tcW w:type="dxa" w:w="864"/>
+          </w:tcPr>
+          <w:p>
+            <w:r>
+              <w:rPr>
+                <w:rFonts w:ascii="Arial" w:hAnsi="Arial"/>
+                <w:sz w:val="18"/>
+              </w:rPr>
+              <w:t>3.361</w:t>
+            </w:r>
+          </w:p>
+        </w:tc>
+        <w:tc>
+          <w:tcPr>
+            <w:tcW w:type="dxa" w:w="864"/>
+          </w:tcPr>
+          <w:p>
+            <w:r>
+              <w:rPr>
+                <w:rFonts w:ascii="Arial" w:hAnsi="Arial"/>
+                <w:sz w:val="18"/>
+              </w:rPr>
+              <w:t>0.287</w:t>
+            </w:r>
+          </w:p>
+        </w:tc>
+        <w:tc>
+          <w:tcPr>
+            <w:tcW w:type="dxa" w:w="864"/>
+          </w:tcPr>
+          <w:p>
+            <w:r>
+              <w:rPr>
+                <w:rFonts w:ascii="Arial" w:hAnsi="Arial"/>
+                <w:sz w:val="18"/>
+              </w:rPr>
+              <w:t>-10.168</w:t>
+            </w:r>
+          </w:p>
+        </w:tc>
+        <w:tc>
+          <w:tcPr>
+            <w:tcW w:type="dxa" w:w="864"/>
+          </w:tcPr>
+          <w:p>
+            <w:r>
+              <w:rPr>
+                <w:rFonts w:ascii="Arial" w:hAnsi="Arial"/>
+                <w:sz w:val="18"/>
+              </w:rPr>
+              <w:t>3.007</w:t>
+            </w:r>
+          </w:p>
+        </w:tc>
+        <w:tc>
+          <w:tcPr>
+            <w:tcW w:type="dxa" w:w="864"/>
+          </w:tcPr>
+          <w:p>
+            <w:r>
+              <w:rPr>
+                <w:rFonts w:ascii="Arial" w:hAnsi="Arial"/>
+                <w:sz w:val="18"/>
+              </w:rPr>
+              <w:t>2.600</w:t>
             </w:r>
           </w:p>
         </w:tc>
@@ -21117,77 +21117,77 @@
                 <w:rFonts w:ascii="Arial" w:hAnsi="Arial"/>
                 <w:sz w:val="18"/>
               </w:rPr>
-              <w:t>-0.091</w:t>
-            </w:r>
-          </w:p>
-        </w:tc>
-        <w:tc>
-          <w:tcPr>
-            <w:tcW w:type="dxa" w:w="864"/>
-          </w:tcPr>
-          <w:p>
-            <w:r>
-              <w:rPr>
-                <w:rFonts w:ascii="Arial" w:hAnsi="Arial"/>
-                <w:sz w:val="18"/>
-              </w:rPr>
-              <w:t>0.075</w:t>
-            </w:r>
-          </w:p>
-        </w:tc>
-        <w:tc>
-          <w:tcPr>
-            <w:tcW w:type="dxa" w:w="864"/>
-          </w:tcPr>
-          <w:p>
-            <w:r>
-              <w:rPr>
-                <w:rFonts w:ascii="Arial" w:hAnsi="Arial"/>
-                <w:sz w:val="18"/>
-              </w:rPr>
-              <w:t>0.225</w:t>
-            </w:r>
-          </w:p>
-        </w:tc>
-        <w:tc>
-          <w:tcPr>
-            <w:tcW w:type="dxa" w:w="864"/>
-          </w:tcPr>
-          <w:p>
-            <w:r>
-              <w:rPr>
-                <w:rFonts w:ascii="Arial" w:hAnsi="Arial"/>
-                <w:sz w:val="18"/>
-              </w:rPr>
-              <w:t>-0.238</w:t>
-            </w:r>
-          </w:p>
-        </w:tc>
-        <w:tc>
-          <w:tcPr>
-            <w:tcW w:type="dxa" w:w="864"/>
-          </w:tcPr>
-          <w:p>
-            <w:r>
-              <w:rPr>
-                <w:rFonts w:ascii="Arial" w:hAnsi="Arial"/>
-                <w:sz w:val="18"/>
-              </w:rPr>
-              <w:t>0.056</w:t>
-            </w:r>
-          </w:p>
-        </w:tc>
-        <w:tc>
-          <w:tcPr>
-            <w:tcW w:type="dxa" w:w="864"/>
-          </w:tcPr>
-          <w:p>
-            <w:r>
-              <w:rPr>
-                <w:rFonts w:ascii="Arial" w:hAnsi="Arial"/>
-                <w:sz w:val="18"/>
-              </w:rPr>
-              <w:t>6.900</w:t>
+              <w:t>-0.205</w:t>
+            </w:r>
+          </w:p>
+        </w:tc>
+        <w:tc>
+          <w:tcPr>
+            <w:tcW w:type="dxa" w:w="864"/>
+          </w:tcPr>
+          <w:p>
+            <w:r>
+              <w:rPr>
+                <w:rFonts w:ascii="Arial" w:hAnsi="Arial"/>
+                <w:sz w:val="18"/>
+              </w:rPr>
+              <w:t>0.157</w:t>
+            </w:r>
+          </w:p>
+        </w:tc>
+        <w:tc>
+          <w:tcPr>
+            <w:tcW w:type="dxa" w:w="864"/>
+          </w:tcPr>
+          <w:p>
+            <w:r>
+              <w:rPr>
+                <w:rFonts w:ascii="Arial" w:hAnsi="Arial"/>
+                <w:sz w:val="18"/>
+              </w:rPr>
+              <w:t>0.191</w:t>
+            </w:r>
+          </w:p>
+        </w:tc>
+        <w:tc>
+          <w:tcPr>
+            <w:tcW w:type="dxa" w:w="864"/>
+          </w:tcPr>
+          <w:p>
+            <w:r>
+              <w:rPr>
+                <w:rFonts w:ascii="Arial" w:hAnsi="Arial"/>
+                <w:sz w:val="18"/>
+              </w:rPr>
+              <w:t>-0.511</w:t>
+            </w:r>
+          </w:p>
+        </w:tc>
+        <w:tc>
+          <w:tcPr>
+            <w:tcW w:type="dxa" w:w="864"/>
+          </w:tcPr>
+          <w:p>
+            <w:r>
+              <w:rPr>
+                <w:rFonts w:ascii="Arial" w:hAnsi="Arial"/>
+                <w:sz w:val="18"/>
+              </w:rPr>
+              <w:t>0.102</w:t>
+            </w:r>
+          </w:p>
+        </w:tc>
+        <w:tc>
+          <w:tcPr>
+            <w:tcW w:type="dxa" w:w="864"/>
+          </w:tcPr>
+          <w:p>
+            <w:r>
+              <w:rPr>
+                <w:rFonts w:ascii="Arial" w:hAnsi="Arial"/>
+                <w:sz w:val="18"/>
+              </w:rPr>
+              <w:t>14.200</w:t>
             </w:r>
           </w:p>
         </w:tc>
@@ -21259,77 +21259,77 @@
                 <w:rFonts w:ascii="Arial" w:hAnsi="Arial"/>
                 <w:sz w:val="18"/>
               </w:rPr>
-              <w:t>-0.138</w:t>
-            </w:r>
-          </w:p>
-        </w:tc>
-        <w:tc>
-          <w:tcPr>
-            <w:tcW w:type="dxa" w:w="864"/>
-          </w:tcPr>
-          <w:p>
-            <w:r>
-              <w:rPr>
-                <w:rFonts w:ascii="Arial" w:hAnsi="Arial"/>
-                <w:sz w:val="18"/>
-              </w:rPr>
-              <w:t>0.050</w:t>
-            </w:r>
-          </w:p>
-        </w:tc>
-        <w:tc>
-          <w:tcPr>
-            <w:tcW w:type="dxa" w:w="864"/>
-          </w:tcPr>
-          <w:p>
-            <w:r>
-              <w:rPr>
-                <w:rFonts w:ascii="Arial" w:hAnsi="Arial"/>
-                <w:sz w:val="18"/>
-              </w:rPr>
-              <w:t>0.006</w:t>
-            </w:r>
-          </w:p>
-        </w:tc>
-        <w:tc>
-          <w:tcPr>
-            <w:tcW w:type="dxa" w:w="864"/>
-          </w:tcPr>
-          <w:p>
-            <w:r>
-              <w:rPr>
-                <w:rFonts w:ascii="Arial" w:hAnsi="Arial"/>
-                <w:sz w:val="18"/>
-              </w:rPr>
-              <w:t>-0.235</w:t>
-            </w:r>
-          </w:p>
-        </w:tc>
-        <w:tc>
-          <w:tcPr>
-            <w:tcW w:type="dxa" w:w="864"/>
-          </w:tcPr>
-          <w:p>
-            <w:r>
-              <w:rPr>
-                <w:rFonts w:ascii="Arial" w:hAnsi="Arial"/>
-                <w:sz w:val="18"/>
-              </w:rPr>
-              <w:t>-0.040</w:t>
-            </w:r>
-          </w:p>
-        </w:tc>
-        <w:tc>
-          <w:tcPr>
-            <w:tcW w:type="dxa" w:w="864"/>
-          </w:tcPr>
-          <w:p>
-            <w:r>
-              <w:rPr>
-                <w:rFonts w:ascii="Arial" w:hAnsi="Arial"/>
-                <w:sz w:val="18"/>
-              </w:rPr>
-              <w:t>-40.700</w:t>
+              <w:t>-0.326</w:t>
+            </w:r>
+          </w:p>
+        </w:tc>
+        <w:tc>
+          <w:tcPr>
+            <w:tcW w:type="dxa" w:w="864"/>
+          </w:tcPr>
+          <w:p>
+            <w:r>
+              <w:rPr>
+                <w:rFonts w:ascii="Arial" w:hAnsi="Arial"/>
+                <w:sz w:val="18"/>
+              </w:rPr>
+              <w:t>0.196</w:t>
+            </w:r>
+          </w:p>
+        </w:tc>
+        <w:tc>
+          <w:tcPr>
+            <w:tcW w:type="dxa" w:w="864"/>
+          </w:tcPr>
+          <w:p>
+            <w:r>
+              <w:rPr>
+                <w:rFonts w:ascii="Arial" w:hAnsi="Arial"/>
+                <w:sz w:val="18"/>
+              </w:rPr>
+              <w:t>0.097</w:t>
+            </w:r>
+          </w:p>
+        </w:tc>
+        <w:tc>
+          <w:tcPr>
+            <w:tcW w:type="dxa" w:w="864"/>
+          </w:tcPr>
+          <w:p>
+            <w:r>
+              <w:rPr>
+                <w:rFonts w:ascii="Arial" w:hAnsi="Arial"/>
+                <w:sz w:val="18"/>
+              </w:rPr>
+              <w:t>-0.711</w:t>
+            </w:r>
+          </w:p>
+        </w:tc>
+        <w:tc>
+          <w:tcPr>
+            <w:tcW w:type="dxa" w:w="864"/>
+          </w:tcPr>
+          <w:p>
+            <w:r>
+              <w:rPr>
+                <w:rFonts w:ascii="Arial" w:hAnsi="Arial"/>
+                <w:sz w:val="18"/>
+              </w:rPr>
+              <w:t>0.058</w:t>
+            </w:r>
+          </w:p>
+        </w:tc>
+        <w:tc>
+          <w:tcPr>
+            <w:tcW w:type="dxa" w:w="864"/>
+          </w:tcPr>
+          <w:p>
+            <w:r>
+              <w:rPr>
+                <w:rFonts w:ascii="Arial" w:hAnsi="Arial"/>
+                <w:sz w:val="18"/>
+              </w:rPr>
+              <w:t>-36.700</w:t>
             </w:r>
           </w:p>
         </w:tc>
@@ -21401,77 +21401,77 @@
                 <w:rFonts w:ascii="Arial" w:hAnsi="Arial"/>
                 <w:sz w:val="18"/>
               </w:rPr>
-              <w:t>-0.063</w:t>
-            </w:r>
-          </w:p>
-        </w:tc>
-        <w:tc>
-          <w:tcPr>
-            <w:tcW w:type="dxa" w:w="864"/>
-          </w:tcPr>
-          <w:p>
-            <w:r>
-              <w:rPr>
-                <w:rFonts w:ascii="Arial" w:hAnsi="Arial"/>
-                <w:sz w:val="18"/>
-              </w:rPr>
-              <w:t>0.062</w:t>
-            </w:r>
-          </w:p>
-        </w:tc>
-        <w:tc>
-          <w:tcPr>
-            <w:tcW w:type="dxa" w:w="864"/>
-          </w:tcPr>
-          <w:p>
-            <w:r>
-              <w:rPr>
-                <w:rFonts w:ascii="Arial" w:hAnsi="Arial"/>
-                <w:sz w:val="18"/>
-              </w:rPr>
-              <w:t>0.306</w:t>
-            </w:r>
-          </w:p>
-        </w:tc>
-        <w:tc>
-          <w:tcPr>
-            <w:tcW w:type="dxa" w:w="864"/>
-          </w:tcPr>
-          <w:p>
-            <w:r>
-              <w:rPr>
-                <w:rFonts w:ascii="Arial" w:hAnsi="Arial"/>
-                <w:sz w:val="18"/>
-              </w:rPr>
-              <w:t>-0.185</w:t>
-            </w:r>
-          </w:p>
-        </w:tc>
-        <w:tc>
-          <w:tcPr>
-            <w:tcW w:type="dxa" w:w="864"/>
-          </w:tcPr>
-          <w:p>
-            <w:r>
-              <w:rPr>
-                <w:rFonts w:ascii="Arial" w:hAnsi="Arial"/>
-                <w:sz w:val="18"/>
-              </w:rPr>
-              <w:t>0.058</w:t>
-            </w:r>
-          </w:p>
-        </w:tc>
-        <w:tc>
-          <w:tcPr>
-            <w:tcW w:type="dxa" w:w="864"/>
-          </w:tcPr>
-          <w:p>
-            <w:r>
-              <w:rPr>
-                <w:rFonts w:ascii="Arial" w:hAnsi="Arial"/>
-                <w:sz w:val="18"/>
-              </w:rPr>
-              <w:t>35.200</w:t>
+              <w:t>-0.095</w:t>
+            </w:r>
+          </w:p>
+        </w:tc>
+        <w:tc>
+          <w:tcPr>
+            <w:tcW w:type="dxa" w:w="864"/>
+          </w:tcPr>
+          <w:p>
+            <w:r>
+              <w:rPr>
+                <w:rFonts w:ascii="Arial" w:hAnsi="Arial"/>
+                <w:sz w:val="18"/>
+              </w:rPr>
+              <w:t>0.059</w:t>
+            </w:r>
+          </w:p>
+        </w:tc>
+        <w:tc>
+          <w:tcPr>
+            <w:tcW w:type="dxa" w:w="864"/>
+          </w:tcPr>
+          <w:p>
+            <w:r>
+              <w:rPr>
+                <w:rFonts w:ascii="Arial" w:hAnsi="Arial"/>
+                <w:sz w:val="18"/>
+              </w:rPr>
+              <w:t>0.109</w:t>
+            </w:r>
+          </w:p>
+        </w:tc>
+        <w:tc>
+          <w:tcPr>
+            <w:tcW w:type="dxa" w:w="864"/>
+          </w:tcPr>
+          <w:p>
+            <w:r>
+              <w:rPr>
+                <w:rFonts w:ascii="Arial" w:hAnsi="Arial"/>
+                <w:sz w:val="18"/>
+              </w:rPr>
+              <w:t>-0.211</w:t>
+            </w:r>
+          </w:p>
+        </w:tc>
+        <w:tc>
+          <w:tcPr>
+            <w:tcW w:type="dxa" w:w="864"/>
+          </w:tcPr>
+          <w:p>
+            <w:r>
+              <w:rPr>
+                <w:rFonts w:ascii="Arial" w:hAnsi="Arial"/>
+                <w:sz w:val="18"/>
+              </w:rPr>
+              <w:t>0.021</w:t>
+            </w:r>
+          </w:p>
+        </w:tc>
+        <w:tc>
+          <w:tcPr>
+            <w:tcW w:type="dxa" w:w="864"/>
+          </w:tcPr>
+          <w:p>
+            <w:r>
+              <w:rPr>
+                <w:rFonts w:ascii="Arial" w:hAnsi="Arial"/>
+                <w:sz w:val="18"/>
+              </w:rPr>
+              <w:t>60.200</w:t>
             </w:r>
           </w:p>
         </w:tc>
@@ -21543,77 +21543,77 @@
                 <w:rFonts w:ascii="Arial" w:hAnsi="Arial"/>
                 <w:sz w:val="18"/>
               </w:rPr>
-              <w:t>-0.128</w:t>
-            </w:r>
-          </w:p>
-        </w:tc>
-        <w:tc>
-          <w:tcPr>
-            <w:tcW w:type="dxa" w:w="864"/>
-          </w:tcPr>
-          <w:p>
-            <w:r>
-              <w:rPr>
-                <w:rFonts w:ascii="Arial" w:hAnsi="Arial"/>
-                <w:sz w:val="18"/>
-              </w:rPr>
-              <w:t>0.056</w:t>
-            </w:r>
-          </w:p>
-        </w:tc>
-        <w:tc>
-          <w:tcPr>
-            <w:tcW w:type="dxa" w:w="864"/>
-          </w:tcPr>
-          <w:p>
-            <w:r>
-              <w:rPr>
-                <w:rFonts w:ascii="Arial" w:hAnsi="Arial"/>
-                <w:sz w:val="18"/>
-              </w:rPr>
-              <w:t>0.023</w:t>
-            </w:r>
-          </w:p>
-        </w:tc>
-        <w:tc>
-          <w:tcPr>
-            <w:tcW w:type="dxa" w:w="864"/>
-          </w:tcPr>
-          <w:p>
-            <w:r>
-              <w:rPr>
-                <w:rFonts w:ascii="Arial" w:hAnsi="Arial"/>
-                <w:sz w:val="18"/>
-              </w:rPr>
-              <w:t>-0.238</w:t>
-            </w:r>
-          </w:p>
-        </w:tc>
-        <w:tc>
-          <w:tcPr>
-            <w:tcW w:type="dxa" w:w="864"/>
-          </w:tcPr>
-          <w:p>
-            <w:r>
-              <w:rPr>
-                <w:rFonts w:ascii="Arial" w:hAnsi="Arial"/>
-                <w:sz w:val="18"/>
-              </w:rPr>
-              <w:t>-0.018</w:t>
-            </w:r>
-          </w:p>
-        </w:tc>
-        <w:tc>
-          <w:tcPr>
-            <w:tcW w:type="dxa" w:w="864"/>
-          </w:tcPr>
-          <w:p>
-            <w:r>
-              <w:rPr>
-                <w:rFonts w:ascii="Arial" w:hAnsi="Arial"/>
-                <w:sz w:val="18"/>
-              </w:rPr>
-              <w:t>-30.500</w:t>
+              <w:t>-0.288</w:t>
+            </w:r>
+          </w:p>
+        </w:tc>
+        <w:tc>
+          <w:tcPr>
+            <w:tcW w:type="dxa" w:w="864"/>
+          </w:tcPr>
+          <w:p>
+            <w:r>
+              <w:rPr>
+                <w:rFonts w:ascii="Arial" w:hAnsi="Arial"/>
+                <w:sz w:val="18"/>
+              </w:rPr>
+              <w:t>0.191</w:t>
+            </w:r>
+          </w:p>
+        </w:tc>
+        <w:tc>
+          <w:tcPr>
+            <w:tcW w:type="dxa" w:w="864"/>
+          </w:tcPr>
+          <w:p>
+            <w:r>
+              <w:rPr>
+                <w:rFonts w:ascii="Arial" w:hAnsi="Arial"/>
+                <w:sz w:val="18"/>
+              </w:rPr>
+              <w:t>0.131</w:t>
+            </w:r>
+          </w:p>
+        </w:tc>
+        <w:tc>
+          <w:tcPr>
+            <w:tcW w:type="dxa" w:w="864"/>
+          </w:tcPr>
+          <w:p>
+            <w:r>
+              <w:rPr>
+                <w:rFonts w:ascii="Arial" w:hAnsi="Arial"/>
+                <w:sz w:val="18"/>
+              </w:rPr>
+              <w:t>-0.662</w:t>
+            </w:r>
+          </w:p>
+        </w:tc>
+        <w:tc>
+          <w:tcPr>
+            <w:tcW w:type="dxa" w:w="864"/>
+          </w:tcPr>
+          <w:p>
+            <w:r>
+              <w:rPr>
+                <w:rFonts w:ascii="Arial" w:hAnsi="Arial"/>
+                <w:sz w:val="18"/>
+              </w:rPr>
+              <w:t>0.086</w:t>
+            </w:r>
+          </w:p>
+        </w:tc>
+        <w:tc>
+          <w:tcPr>
+            <w:tcW w:type="dxa" w:w="864"/>
+          </w:tcPr>
+          <w:p>
+            <w:r>
+              <w:rPr>
+                <w:rFonts w:ascii="Arial" w:hAnsi="Arial"/>
+                <w:sz w:val="18"/>
+              </w:rPr>
+              <w:t>-20.700</w:t>
             </w:r>
           </w:p>
         </w:tc>
@@ -21685,77 +21685,77 @@
                 <w:rFonts w:ascii="Arial" w:hAnsi="Arial"/>
                 <w:sz w:val="18"/>
               </w:rPr>
-              <w:t>-0.065</w:t>
-            </w:r>
-          </w:p>
-        </w:tc>
-        <w:tc>
-          <w:tcPr>
-            <w:tcW w:type="dxa" w:w="864"/>
-          </w:tcPr>
-          <w:p>
-            <w:r>
-              <w:rPr>
-                <w:rFonts w:ascii="Arial" w:hAnsi="Arial"/>
-                <w:sz w:val="18"/>
-              </w:rPr>
-              <w:t>0.078</w:t>
-            </w:r>
-          </w:p>
-        </w:tc>
-        <w:tc>
-          <w:tcPr>
-            <w:tcW w:type="dxa" w:w="864"/>
-          </w:tcPr>
-          <w:p>
-            <w:r>
-              <w:rPr>
-                <w:rFonts w:ascii="Arial" w:hAnsi="Arial"/>
-                <w:sz w:val="18"/>
-              </w:rPr>
-              <w:t>0.400</w:t>
-            </w:r>
-          </w:p>
-        </w:tc>
-        <w:tc>
-          <w:tcPr>
-            <w:tcW w:type="dxa" w:w="864"/>
-          </w:tcPr>
-          <w:p>
-            <w:r>
-              <w:rPr>
-                <w:rFonts w:ascii="Arial" w:hAnsi="Arial"/>
-                <w:sz w:val="18"/>
-              </w:rPr>
-              <w:t>-0.217</w:t>
-            </w:r>
-          </w:p>
-        </w:tc>
-        <w:tc>
-          <w:tcPr>
-            <w:tcW w:type="dxa" w:w="864"/>
-          </w:tcPr>
-          <w:p>
-            <w:r>
-              <w:rPr>
-                <w:rFonts w:ascii="Arial" w:hAnsi="Arial"/>
-                <w:sz w:val="18"/>
-              </w:rPr>
-              <w:t>0.087</w:t>
-            </w:r>
-          </w:p>
-        </w:tc>
-        <w:tc>
-          <w:tcPr>
-            <w:tcW w:type="dxa" w:w="864"/>
-          </w:tcPr>
-          <w:p>
-            <w:r>
-              <w:rPr>
-                <w:rFonts w:ascii="Arial" w:hAnsi="Arial"/>
-                <w:sz w:val="18"/>
-              </w:rPr>
-              <w:t>33.300</w:t>
+              <w:t>-0.215</w:t>
+            </w:r>
+          </w:p>
+        </w:tc>
+        <w:tc>
+          <w:tcPr>
+            <w:tcW w:type="dxa" w:w="864"/>
+          </w:tcPr>
+          <w:p>
+            <w:r>
+              <w:rPr>
+                <w:rFonts w:ascii="Arial" w:hAnsi="Arial"/>
+                <w:sz w:val="18"/>
+              </w:rPr>
+              <w:t>0.219</w:t>
+            </w:r>
+          </w:p>
+        </w:tc>
+        <w:tc>
+          <w:tcPr>
+            <w:tcW w:type="dxa" w:w="864"/>
+          </w:tcPr>
+          <w:p>
+            <w:r>
+              <w:rPr>
+                <w:rFonts w:ascii="Arial" w:hAnsi="Arial"/>
+                <w:sz w:val="18"/>
+              </w:rPr>
+              <w:t>0.325</w:t>
+            </w:r>
+          </w:p>
+        </w:tc>
+        <w:tc>
+          <w:tcPr>
+            <w:tcW w:type="dxa" w:w="864"/>
+          </w:tcPr>
+          <w:p>
+            <w:r>
+              <w:rPr>
+                <w:rFonts w:ascii="Arial" w:hAnsi="Arial"/>
+                <w:sz w:val="18"/>
+              </w:rPr>
+              <w:t>-0.644</w:t>
+            </w:r>
+          </w:p>
+        </w:tc>
+        <w:tc>
+          <w:tcPr>
+            <w:tcW w:type="dxa" w:w="864"/>
+          </w:tcPr>
+          <w:p>
+            <w:r>
+              <w:rPr>
+                <w:rFonts w:ascii="Arial" w:hAnsi="Arial"/>
+                <w:sz w:val="18"/>
+              </w:rPr>
+              <w:t>0.214</w:t>
+            </w:r>
+          </w:p>
+        </w:tc>
+        <w:tc>
+          <w:tcPr>
+            <w:tcW w:type="dxa" w:w="864"/>
+          </w:tcPr>
+          <w:p>
+            <w:r>
+              <w:rPr>
+                <w:rFonts w:ascii="Arial" w:hAnsi="Arial"/>
+                <w:sz w:val="18"/>
+              </w:rPr>
+              <w:t>9.700</w:t>
             </w:r>
           </w:p>
         </w:tc>
@@ -21827,63 +21827,63 @@
                 <w:rFonts w:ascii="Arial" w:hAnsi="Arial"/>
                 <w:sz w:val="18"/>
               </w:rPr>
-              <w:t>-0.098</w:t>
-            </w:r>
-          </w:p>
-        </w:tc>
-        <w:tc>
-          <w:tcPr>
-            <w:tcW w:type="dxa" w:w="864"/>
-          </w:tcPr>
-          <w:p>
-            <w:r>
-              <w:rPr>
-                <w:rFonts w:ascii="Arial" w:hAnsi="Arial"/>
-                <w:sz w:val="18"/>
-              </w:rPr>
-              <w:t>0.061</w:t>
-            </w:r>
-          </w:p>
-        </w:tc>
-        <w:tc>
-          <w:tcPr>
-            <w:tcW w:type="dxa" w:w="864"/>
-          </w:tcPr>
-          <w:p>
-            <w:r>
-              <w:rPr>
-                <w:rFonts w:ascii="Arial" w:hAnsi="Arial"/>
-                <w:sz w:val="18"/>
-              </w:rPr>
-              <w:t>0.111</w:t>
-            </w:r>
-          </w:p>
-        </w:tc>
-        <w:tc>
-          <w:tcPr>
-            <w:tcW w:type="dxa" w:w="864"/>
-          </w:tcPr>
-          <w:p>
-            <w:r>
-              <w:rPr>
-                <w:rFonts w:ascii="Arial" w:hAnsi="Arial"/>
-                <w:sz w:val="18"/>
-              </w:rPr>
-              <w:t>-0.218</w:t>
-            </w:r>
-          </w:p>
-        </w:tc>
-        <w:tc>
-          <w:tcPr>
-            <w:tcW w:type="dxa" w:w="864"/>
-          </w:tcPr>
-          <w:p>
-            <w:r>
-              <w:rPr>
-                <w:rFonts w:ascii="Arial" w:hAnsi="Arial"/>
-                <w:sz w:val="18"/>
-              </w:rPr>
-              <w:t>0.023</w:t>
+              <w:t>-0.239</w:t>
+            </w:r>
+          </w:p>
+        </w:tc>
+        <w:tc>
+          <w:tcPr>
+            <w:tcW w:type="dxa" w:w="864"/>
+          </w:tcPr>
+          <w:p>
+            <w:r>
+              <w:rPr>
+                <w:rFonts w:ascii="Arial" w:hAnsi="Arial"/>
+                <w:sz w:val="18"/>
+              </w:rPr>
+              <w:t>0.169</w:t>
+            </w:r>
+          </w:p>
+        </w:tc>
+        <w:tc>
+          <w:tcPr>
+            <w:tcW w:type="dxa" w:w="864"/>
+          </w:tcPr>
+          <w:p>
+            <w:r>
+              <w:rPr>
+                <w:rFonts w:ascii="Arial" w:hAnsi="Arial"/>
+                <w:sz w:val="18"/>
+              </w:rPr>
+              <w:t>0.158</w:t>
+            </w:r>
+          </w:p>
+        </w:tc>
+        <w:tc>
+          <w:tcPr>
+            <w:tcW w:type="dxa" w:w="864"/>
+          </w:tcPr>
+          <w:p>
+            <w:r>
+              <w:rPr>
+                <w:rFonts w:ascii="Arial" w:hAnsi="Arial"/>
+                <w:sz w:val="18"/>
+              </w:rPr>
+              <w:t>-0.570</w:t>
+            </w:r>
+          </w:p>
+        </w:tc>
+        <w:tc>
+          <w:tcPr>
+            <w:tcW w:type="dxa" w:w="864"/>
+          </w:tcPr>
+          <w:p>
+            <w:r>
+              <w:rPr>
+                <w:rFonts w:ascii="Arial" w:hAnsi="Arial"/>
+                <w:sz w:val="18"/>
+              </w:rPr>
+              <w:t>0.092</w:t>
             </w:r>
           </w:p>
         </w:tc>
@@ -21969,77 +21969,77 @@
                 <w:rFonts w:ascii="Arial" w:hAnsi="Arial"/>
                 <w:sz w:val="18"/>
               </w:rPr>
-              <w:t>-0.100</w:t>
-            </w:r>
-          </w:p>
-        </w:tc>
-        <w:tc>
-          <w:tcPr>
-            <w:tcW w:type="dxa" w:w="864"/>
-          </w:tcPr>
-          <w:p>
-            <w:r>
-              <w:rPr>
-                <w:rFonts w:ascii="Arial" w:hAnsi="Arial"/>
-                <w:sz w:val="18"/>
-              </w:rPr>
-              <w:t>0.065</w:t>
-            </w:r>
-          </w:p>
-        </w:tc>
-        <w:tc>
-          <w:tcPr>
-            <w:tcW w:type="dxa" w:w="864"/>
-          </w:tcPr>
-          <w:p>
-            <w:r>
-              <w:rPr>
-                <w:rFonts w:ascii="Arial" w:hAnsi="Arial"/>
-                <w:sz w:val="18"/>
-              </w:rPr>
-              <w:t>0.127</w:t>
-            </w:r>
-          </w:p>
-        </w:tc>
-        <w:tc>
-          <w:tcPr>
-            <w:tcW w:type="dxa" w:w="864"/>
-          </w:tcPr>
-          <w:p>
-            <w:r>
-              <w:rPr>
-                <w:rFonts w:ascii="Arial" w:hAnsi="Arial"/>
-                <w:sz w:val="18"/>
-              </w:rPr>
-              <w:t>-0.228</w:t>
-            </w:r>
-          </w:p>
-        </w:tc>
-        <w:tc>
-          <w:tcPr>
-            <w:tcW w:type="dxa" w:w="864"/>
-          </w:tcPr>
-          <w:p>
-            <w:r>
-              <w:rPr>
-                <w:rFonts w:ascii="Arial" w:hAnsi="Arial"/>
-                <w:sz w:val="18"/>
-              </w:rPr>
-              <w:t>0.028</w:t>
-            </w:r>
-          </w:p>
-        </w:tc>
-        <w:tc>
-          <w:tcPr>
-            <w:tcW w:type="dxa" w:w="864"/>
-          </w:tcPr>
-          <w:p>
-            <w:r>
-              <w:rPr>
-                <w:rFonts w:ascii="Arial" w:hAnsi="Arial"/>
-                <w:sz w:val="18"/>
-              </w:rPr>
-              <w:t>-2.000</w:t>
+              <w:t>-0.244</w:t>
+            </w:r>
+          </w:p>
+        </w:tc>
+        <w:tc>
+          <w:tcPr>
+            <w:tcW w:type="dxa" w:w="864"/>
+          </w:tcPr>
+          <w:p>
+            <w:r>
+              <w:rPr>
+                <w:rFonts w:ascii="Arial" w:hAnsi="Arial"/>
+                <w:sz w:val="18"/>
+              </w:rPr>
+              <w:t>0.178</w:t>
+            </w:r>
+          </w:p>
+        </w:tc>
+        <w:tc>
+          <w:tcPr>
+            <w:tcW w:type="dxa" w:w="864"/>
+          </w:tcPr>
+          <w:p>
+            <w:r>
+              <w:rPr>
+                <w:rFonts w:ascii="Arial" w:hAnsi="Arial"/>
+                <w:sz w:val="18"/>
+              </w:rPr>
+              <w:t>0.171</w:t>
+            </w:r>
+          </w:p>
+        </w:tc>
+        <w:tc>
+          <w:tcPr>
+            <w:tcW w:type="dxa" w:w="864"/>
+          </w:tcPr>
+          <w:p>
+            <w:r>
+              <w:rPr>
+                <w:rFonts w:ascii="Arial" w:hAnsi="Arial"/>
+                <w:sz w:val="18"/>
+              </w:rPr>
+              <w:t>-0.594</w:t>
+            </w:r>
+          </w:p>
+        </w:tc>
+        <w:tc>
+          <w:tcPr>
+            <w:tcW w:type="dxa" w:w="864"/>
+          </w:tcPr>
+          <w:p>
+            <w:r>
+              <w:rPr>
+                <w:rFonts w:ascii="Arial" w:hAnsi="Arial"/>
+                <w:sz w:val="18"/>
+              </w:rPr>
+              <w:t>0.105</w:t>
+            </w:r>
+          </w:p>
+        </w:tc>
+        <w:tc>
+          <w:tcPr>
+            <w:tcW w:type="dxa" w:w="864"/>
+          </w:tcPr>
+          <w:p>
+            <w:r>
+              <w:rPr>
+                <w:rFonts w:ascii="Arial" w:hAnsi="Arial"/>
+                <w:sz w:val="18"/>
+              </w:rPr>
+              <w:t>-2.300</w:t>
             </w:r>
           </w:p>
         </w:tc>
@@ -22111,77 +22111,77 @@
                 <w:rFonts w:ascii="Arial" w:hAnsi="Arial"/>
                 <w:sz w:val="18"/>
               </w:rPr>
-              <w:t>-0.088</w:t>
-            </w:r>
-          </w:p>
-        </w:tc>
-        <w:tc>
-          <w:tcPr>
-            <w:tcW w:type="dxa" w:w="864"/>
-          </w:tcPr>
-          <w:p>
-            <w:r>
-              <w:rPr>
-                <w:rFonts w:ascii="Arial" w:hAnsi="Arial"/>
-                <w:sz w:val="18"/>
-              </w:rPr>
-              <w:t>0.087</w:t>
-            </w:r>
-          </w:p>
-        </w:tc>
-        <w:tc>
-          <w:tcPr>
-            <w:tcW w:type="dxa" w:w="864"/>
-          </w:tcPr>
-          <w:p>
-            <w:r>
-              <w:rPr>
-                <w:rFonts w:ascii="Arial" w:hAnsi="Arial"/>
-                <w:sz w:val="18"/>
-              </w:rPr>
-              <w:t>0.310</w:t>
-            </w:r>
-          </w:p>
-        </w:tc>
-        <w:tc>
-          <w:tcPr>
-            <w:tcW w:type="dxa" w:w="864"/>
-          </w:tcPr>
-          <w:p>
-            <w:r>
-              <w:rPr>
-                <w:rFonts w:ascii="Arial" w:hAnsi="Arial"/>
-                <w:sz w:val="18"/>
-              </w:rPr>
-              <w:t>-0.257</w:t>
-            </w:r>
-          </w:p>
-        </w:tc>
-        <w:tc>
-          <w:tcPr>
-            <w:tcW w:type="dxa" w:w="864"/>
-          </w:tcPr>
-          <w:p>
-            <w:r>
-              <w:rPr>
-                <w:rFonts w:ascii="Arial" w:hAnsi="Arial"/>
-                <w:sz w:val="18"/>
-              </w:rPr>
-              <w:t>0.082</w:t>
-            </w:r>
-          </w:p>
-        </w:tc>
-        <w:tc>
-          <w:tcPr>
-            <w:tcW w:type="dxa" w:w="864"/>
-          </w:tcPr>
-          <w:p>
-            <w:r>
-              <w:rPr>
-                <w:rFonts w:ascii="Arial" w:hAnsi="Arial"/>
-                <w:sz w:val="18"/>
-              </w:rPr>
-              <w:t>10.300</w:t>
+              <w:t>-0.279</w:t>
+            </w:r>
+          </w:p>
+        </w:tc>
+        <w:tc>
+          <w:tcPr>
+            <w:tcW w:type="dxa" w:w="864"/>
+          </w:tcPr>
+          <w:p>
+            <w:r>
+              <w:rPr>
+                <w:rFonts w:ascii="Arial" w:hAnsi="Arial"/>
+                <w:sz w:val="18"/>
+              </w:rPr>
+              <w:t>0.242</w:t>
+            </w:r>
+          </w:p>
+        </w:tc>
+        <w:tc>
+          <w:tcPr>
+            <w:tcW w:type="dxa" w:w="864"/>
+          </w:tcPr>
+          <w:p>
+            <w:r>
+              <w:rPr>
+                <w:rFonts w:ascii="Arial" w:hAnsi="Arial"/>
+                <w:sz w:val="18"/>
+              </w:rPr>
+              <w:t>0.249</w:t>
+            </w:r>
+          </w:p>
+        </w:tc>
+        <w:tc>
+          <w:tcPr>
+            <w:tcW w:type="dxa" w:w="864"/>
+          </w:tcPr>
+          <w:p>
+            <w:r>
+              <w:rPr>
+                <w:rFonts w:ascii="Arial" w:hAnsi="Arial"/>
+                <w:sz w:val="18"/>
+              </w:rPr>
+              <w:t>-0.754</w:t>
+            </w:r>
+          </w:p>
+        </w:tc>
+        <w:tc>
+          <w:tcPr>
+            <w:tcW w:type="dxa" w:w="864"/>
+          </w:tcPr>
+          <w:p>
+            <w:r>
+              <w:rPr>
+                <w:rFonts w:ascii="Arial" w:hAnsi="Arial"/>
+                <w:sz w:val="18"/>
+              </w:rPr>
+              <w:t>0.196</w:t>
+            </w:r>
+          </w:p>
+        </w:tc>
+        <w:tc>
+          <w:tcPr>
+            <w:tcW w:type="dxa" w:w="864"/>
+          </w:tcPr>
+          <w:p>
+            <w:r>
+              <w:rPr>
+                <w:rFonts w:ascii="Arial" w:hAnsi="Arial"/>
+                <w:sz w:val="18"/>
+              </w:rPr>
+              <w:t>-17.000</w:t>
             </w:r>
           </w:p>
         </w:tc>
@@ -22211,7 +22211,7 @@
         <w:keepNext/>
         <w:spacing w:before="240" w:after="120"/>
       </w:pPr>
-      <w:bookmarkStart w:id="25430" w:name="table_s6"/>
+      <w:bookmarkStart w:id="37421" w:name="table_s6"/>
       <w:r>
         <w:rPr>
           <w:rFonts w:ascii="Arial" w:hAnsi="Arial"/>
@@ -22221,7 +22221,7 @@
         </w:rPr>
         <w:t>Table S6 — MDE / power</w:t>
       </w:r>
-      <w:bookmarkEnd w:id="25430"/>
+      <w:bookmarkEnd w:id="37421"/>
     </w:p>
     <w:p>
       <w:pPr>
@@ -23082,7 +23082,7 @@
         <w:keepNext/>
         <w:spacing w:before="240" w:after="120"/>
       </w:pPr>
-      <w:bookmarkStart w:id="59492" w:name="table_s7"/>
+      <w:bookmarkStart w:id="45456" w:name="table_s7"/>
       <w:r>
         <w:rPr>
           <w:rFonts w:ascii="Arial" w:hAnsi="Arial"/>
@@ -23092,7 +23092,7 @@
         </w:rPr>
         <w:t>Table S7 — Placebo / falsification</w:t>
       </w:r>
-      <w:bookmarkEnd w:id="59492"/>
+      <w:bookmarkEnd w:id="45456"/>
     </w:p>
     <w:p>
       <w:r>
@@ -23749,63 +23749,63 @@
                 <w:rFonts w:ascii="Arial" w:hAnsi="Arial"/>
                 <w:sz w:val="18"/>
               </w:rPr>
-              <w:t>+15.22</w:t>
-            </w:r>
-          </w:p>
-        </w:tc>
-        <w:tc>
-          <w:tcPr>
-            <w:tcW w:type="dxa" w:w="864"/>
-          </w:tcPr>
-          <w:p>
-            <w:r>
-              <w:rPr>
-                <w:rFonts w:ascii="Arial" w:hAnsi="Arial"/>
-                <w:sz w:val="18"/>
-              </w:rPr>
-              <w:t>-1.15</w:t>
-            </w:r>
-          </w:p>
-        </w:tc>
-        <w:tc>
-          <w:tcPr>
-            <w:tcW w:type="dxa" w:w="864"/>
-          </w:tcPr>
-          <w:p>
-            <w:r>
-              <w:rPr>
-                <w:rFonts w:ascii="Arial" w:hAnsi="Arial"/>
-                <w:sz w:val="18"/>
-              </w:rPr>
-              <w:t>-32.50</w:t>
-            </w:r>
-          </w:p>
-        </w:tc>
-        <w:tc>
-          <w:tcPr>
-            <w:tcW w:type="dxa" w:w="864"/>
-          </w:tcPr>
-          <w:p>
-            <w:r>
-              <w:rPr>
-                <w:rFonts w:ascii="Arial" w:hAnsi="Arial"/>
-                <w:sz w:val="18"/>
-              </w:rPr>
-              <w:t>+28.75</w:t>
-            </w:r>
-          </w:p>
-        </w:tc>
-        <w:tc>
-          <w:tcPr>
-            <w:tcW w:type="dxa" w:w="864"/>
-          </w:tcPr>
-          <w:p>
-            <w:r>
-              <w:rPr>
-                <w:rFonts w:ascii="Arial" w:hAnsi="Arial"/>
-                <w:sz w:val="18"/>
-              </w:rPr>
-              <w:t>+43.48</w:t>
+              <w:t>+15.11</w:t>
+            </w:r>
+          </w:p>
+        </w:tc>
+        <w:tc>
+          <w:tcPr>
+            <w:tcW w:type="dxa" w:w="864"/>
+          </w:tcPr>
+          <w:p>
+            <w:r>
+              <w:rPr>
+                <w:rFonts w:ascii="Arial" w:hAnsi="Arial"/>
+                <w:sz w:val="18"/>
+              </w:rPr>
+              <w:t>-1.16</w:t>
+            </w:r>
+          </w:p>
+        </w:tc>
+        <w:tc>
+          <w:tcPr>
+            <w:tcW w:type="dxa" w:w="864"/>
+          </w:tcPr>
+          <w:p>
+            <w:r>
+              <w:rPr>
+                <w:rFonts w:ascii="Arial" w:hAnsi="Arial"/>
+                <w:sz w:val="18"/>
+              </w:rPr>
+              <w:t>-32.47</w:t>
+            </w:r>
+          </w:p>
+        </w:tc>
+        <w:tc>
+          <w:tcPr>
+            <w:tcW w:type="dxa" w:w="864"/>
+          </w:tcPr>
+          <w:p>
+            <w:r>
+              <w:rPr>
+                <w:rFonts w:ascii="Arial" w:hAnsi="Arial"/>
+                <w:sz w:val="18"/>
+              </w:rPr>
+              <w:t>+28.68</w:t>
+            </w:r>
+          </w:p>
+        </w:tc>
+        <w:tc>
+          <w:tcPr>
+            <w:tcW w:type="dxa" w:w="864"/>
+          </w:tcPr>
+          <w:p>
+            <w:r>
+              <w:rPr>
+                <w:rFonts w:ascii="Arial" w:hAnsi="Arial"/>
+                <w:sz w:val="18"/>
+              </w:rPr>
+              <w:t>+43.44</w:t>
             </w:r>
           </w:p>
         </w:tc>
@@ -23891,63 +23891,63 @@
                 <w:rFonts w:ascii="Arial" w:hAnsi="Arial"/>
                 <w:sz w:val="18"/>
               </w:rPr>
-              <w:t>-3.62</w:t>
-            </w:r>
-          </w:p>
-        </w:tc>
-        <w:tc>
-          <w:tcPr>
-            <w:tcW w:type="dxa" w:w="864"/>
-          </w:tcPr>
-          <w:p>
-            <w:r>
-              <w:rPr>
-                <w:rFonts w:ascii="Arial" w:hAnsi="Arial"/>
-                <w:sz w:val="18"/>
-              </w:rPr>
-              <w:t>-0.30</w:t>
-            </w:r>
-          </w:p>
-        </w:tc>
-        <w:tc>
-          <w:tcPr>
-            <w:tcW w:type="dxa" w:w="864"/>
-          </w:tcPr>
-          <w:p>
-            <w:r>
-              <w:rPr>
-                <w:rFonts w:ascii="Arial" w:hAnsi="Arial"/>
-                <w:sz w:val="18"/>
-              </w:rPr>
-              <w:t>-4.80</w:t>
-            </w:r>
-          </w:p>
-        </w:tc>
-        <w:tc>
-          <w:tcPr>
-            <w:tcW w:type="dxa" w:w="864"/>
-          </w:tcPr>
-          <w:p>
-            <w:r>
-              <w:rPr>
-                <w:rFonts w:ascii="Arial" w:hAnsi="Arial"/>
-                <w:sz w:val="18"/>
-              </w:rPr>
-              <w:t>+4.61</w:t>
-            </w:r>
-          </w:p>
-        </w:tc>
-        <w:tc>
-          <w:tcPr>
-            <w:tcW w:type="dxa" w:w="864"/>
-          </w:tcPr>
-          <w:p>
-            <w:r>
-              <w:rPr>
-                <w:rFonts w:ascii="Arial" w:hAnsi="Arial"/>
-                <w:sz w:val="18"/>
-              </w:rPr>
-              <w:t>+6.15</w:t>
+              <w:t>-3.68</w:t>
+            </w:r>
+          </w:p>
+        </w:tc>
+        <w:tc>
+          <w:tcPr>
+            <w:tcW w:type="dxa" w:w="864"/>
+          </w:tcPr>
+          <w:p>
+            <w:r>
+              <w:rPr>
+                <w:rFonts w:ascii="Arial" w:hAnsi="Arial"/>
+                <w:sz w:val="18"/>
+              </w:rPr>
+              <w:t>-0.29</w:t>
+            </w:r>
+          </w:p>
+        </w:tc>
+        <w:tc>
+          <w:tcPr>
+            <w:tcW w:type="dxa" w:w="864"/>
+          </w:tcPr>
+          <w:p>
+            <w:r>
+              <w:rPr>
+                <w:rFonts w:ascii="Arial" w:hAnsi="Arial"/>
+                <w:sz w:val="18"/>
+              </w:rPr>
+              <w:t>-4.78</w:t>
+            </w:r>
+          </w:p>
+        </w:tc>
+        <w:tc>
+          <w:tcPr>
+            <w:tcW w:type="dxa" w:w="864"/>
+          </w:tcPr>
+          <w:p>
+            <w:r>
+              <w:rPr>
+                <w:rFonts w:ascii="Arial" w:hAnsi="Arial"/>
+                <w:sz w:val="18"/>
+              </w:rPr>
+              <w:t>+4.65</w:t>
+            </w:r>
+          </w:p>
+        </w:tc>
+        <w:tc>
+          <w:tcPr>
+            <w:tcW w:type="dxa" w:w="864"/>
+          </w:tcPr>
+          <w:p>
+            <w:r>
+              <w:rPr>
+                <w:rFonts w:ascii="Arial" w:hAnsi="Arial"/>
+                <w:sz w:val="18"/>
+              </w:rPr>
+              <w:t>+6.17</w:t>
             </w:r>
           </w:p>
         </w:tc>
@@ -24693,7 +24693,7 @@
         <w:keepNext/>
         <w:spacing w:before="240" w:after="120"/>
       </w:pPr>
-      <w:bookmarkStart w:id="16771" w:name="table_s8"/>
+      <w:bookmarkStart w:id="98866" w:name="table_s8"/>
       <w:r>
         <w:rPr>
           <w:rFonts w:ascii="Arial" w:hAnsi="Arial"/>
@@ -24703,7 +24703,7 @@
         </w:rPr>
         <w:t>Table S8 — Pre-Kharif cyclone climatology</w:t>
       </w:r>
-      <w:bookmarkEnd w:id="16771"/>
+      <w:bookmarkEnd w:id="98866"/>
     </w:p>
     <w:p>
       <w:r>
@@ -25569,7 +25569,7 @@
         <w:keepNext/>
         <w:spacing w:before="240" w:after="120"/>
       </w:pPr>
-      <w:bookmarkStart w:id="47451" w:name="table_s9"/>
+      <w:bookmarkStart w:id="21581" w:name="table_s9"/>
       <w:r>
         <w:rPr>
           <w:rFonts w:ascii="Arial" w:hAnsi="Arial"/>
@@ -25579,7 +25579,7 @@
         </w:rPr>
         <w:t>Table S9 — Canonical S1 dual-pol features</w:t>
       </w:r>
-      <w:bookmarkEnd w:id="47451"/>
+      <w:bookmarkEnd w:id="21581"/>
     </w:p>
     <w:p>
       <w:r>
@@ -26503,7 +26503,7 @@
         <w:keepNext/>
         <w:spacing w:before="240" w:after="120"/>
       </w:pPr>
-      <w:bookmarkStart w:id="59493" w:name="figure_s1"/>
+      <w:bookmarkStart w:id="99162" w:name="figure_s1"/>
       <w:r>
         <w:rPr>
           <w:rFonts w:ascii="Arial" w:hAnsi="Arial"/>
@@ -26513,7 +26513,7 @@
         </w:rPr>
         <w:t>Figure S1 — Pre-Kharif cyclone climatology</w:t>
       </w:r>
-      <w:bookmarkEnd w:id="59493"/>
+      <w:bookmarkEnd w:id="99162"/>
     </w:p>
     <w:p>
       <w:pPr>
@@ -26594,7 +26594,7 @@
         <w:keepNext/>
         <w:spacing w:before="240" w:after="120"/>
       </w:pPr>
-      <w:bookmarkStart w:id="83204" w:name="figure_s2"/>
+      <w:bookmarkStart w:id="92975" w:name="figure_s2"/>
       <w:r>
         <w:rPr>
           <w:rFonts w:ascii="Arial" w:hAnsi="Arial"/>
@@ -26604,7 +26604,7 @@
         </w:rPr>
         <w:t>Figure S2 — Canonical Sentinel-1 backscatter signatures</w:t>
       </w:r>
-      <w:bookmarkEnd w:id="83204"/>
+      <w:bookmarkEnd w:id="92975"/>
     </w:p>
     <w:p>
       <w:pPr>

</xml_diff>